<commit_message>
Wi-Fi: a WPA/WPA2 mixed-mode network (group key TKIP, common on 2.4 GHz) joins and gets its address (Circle: wsec from the IE's ciphers); docs: 2.4 / 5 GHz, freq_list, country
Co-Authored-By: Claude Opus 5.5 <noreply@anthropic.com>
Claude-Session: https://claude.ai/code/session_01UcY36na7Mp1DEYttKiw1pa
</commit_message>
<xml_diff>
--- a/docs/exports/05-CIRCLE-CHANGES.docx
+++ b/docs/exports/05-CIRCLE-CHANGES.docx
@@ -2226,6 +2226,124 @@
                 <w:rStyle w:val="VerbatimChar"/>
               </w:rPr>
               <w:t xml:space="preserve">libnet</w:t>
+            </w:r>
+          </w:p>
+        </w:tc>
+      </w:tr>
+      <w:tr>
+        <w:tc>
+          <w:tcPr/>
+          <w:p>
+            <w:pPr>
+              <w:pStyle w:val="Compact"/>
+            </w:pPr>
+            <w:r>
+              <w:t xml:space="preserve">23</w:t>
+            </w:r>
+          </w:p>
+        </w:tc>
+        <w:tc>
+          <w:tcPr/>
+          <w:p>
+            <w:pPr>
+              <w:pStyle w:val="Compact"/>
+            </w:pPr>
+            <w:r>
+              <w:rPr>
+                <w:b/>
+                <w:bCs/>
+              </w:rPr>
+              <w:t xml:space="preserve">Wi-Fi: the firmware's</w:t>
+            </w:r>
+            <w:r>
+              <w:rPr>
+                <w:b/>
+                <w:bCs/>
+              </w:rPr>
+              <w:t xml:space="preserve"> </w:t>
+            </w:r>
+            <w:r>
+              <w:rPr>
+                <w:rStyle w:val="VerbatimChar"/>
+                <w:b/>
+                <w:bCs/>
+              </w:rPr>
+              <w:t xml:space="preserve">wsec</w:t>
+            </w:r>
+            <w:r>
+              <w:rPr>
+                <w:b/>
+                <w:bCs/>
+              </w:rPr>
+              <w:t xml:space="preserve"> </w:t>
+            </w:r>
+            <w:r>
+              <w:rPr>
+                <w:b/>
+                <w:bCs/>
+              </w:rPr>
+              <w:t xml:space="preserve">from the IE's ciphers</w:t>
+            </w:r>
+            <w:r>
+              <w:t xml:space="preserve"> </w:t>
+            </w:r>
+            <w:r>
+              <w:t xml:space="preserve">(group + pairwise: TKIP 2, AES 4, as Linux's brcmfmac) -- WPA2 was always "aes": a WPA/WPA2 mixed-mode network (pairwise CCMP, group TKIP, common on 2.4 GHz) associated but no broadcast was decoded (no DHCP offer: the link stayed down)</w:t>
+            </w:r>
+          </w:p>
+        </w:tc>
+        <w:tc>
+          <w:tcPr/>
+          <w:p>
+            <w:pPr>
+              <w:pStyle w:val="Compact"/>
+            </w:pPr>
+            <w:r>
+              <w:rPr>
+                <w:rStyle w:val="VerbatimChar"/>
+              </w:rPr>
+              <w:t xml:space="preserve">addon/wlan/ether4330.c</w:t>
+            </w:r>
+            <w:r>
+              <w:t xml:space="preserve"> </w:t>
+            </w:r>
+            <w:r>
+              <w:t xml:space="preserve">(</w:t>
+            </w:r>
+            <w:r>
+              <w:rPr>
+                <w:rStyle w:val="VerbatimChar"/>
+              </w:rPr>
+              <w:t xml:space="preserve">iewsec</w:t>
+            </w:r>
+            <w:r>
+              <w:t xml:space="preserve">,</w:t>
+            </w:r>
+            <w:r>
+              <w:t xml:space="preserve"> </w:t>
+            </w:r>
+            <w:r>
+              <w:rPr>
+                <w:rStyle w:val="VerbatimChar"/>
+              </w:rPr>
+              <w:t xml:space="preserve">setauth</w:t>
+            </w:r>
+            <w:r>
+              <w:t xml:space="preserve">)</w:t>
+            </w:r>
+          </w:p>
+        </w:tc>
+        <w:tc>
+          <w:tcPr/>
+          <w:p>
+            <w:pPr>
+              <w:pStyle w:val="Compact"/>
+            </w:pPr>
+            <w:r>
+              <w:rPr>
+                <w:rStyle w:val="VerbatimChar"/>
+              </w:rPr>
+              <w:t xml:space="preserve">libwlan</w:t>
             </w:r>
           </w:p>
         </w:tc>

</xml_diff>

<commit_message>
Wi-Fi: the cipher change reverted (Circle daff21f); the kernel rebuilt and staged
Circle's 6f3542b (the firmware's wsec from the IE's ciphers) reverted: with it the
user's WPA2-PSK network no longer came up. Back to the fixed wsec (aes for WPA2).
docs 05 (patch 23 marked reverted), 04 (mixed-mode routers: WPA2/AES only), exports.

Co-Authored-By: Claude Opus 5.5 <noreply@anthropic.com>
Claude-Session: https://claude.ai/code/session_018vcYqFmwcdMsmNMcVF62sL
</commit_message>
<xml_diff>
--- a/docs/exports/05-CIRCLE-CHANGES.docx
+++ b/docs/exports/05-CIRCLE-CHANGES.docx
@@ -2252,43 +2252,91 @@
               <w:rPr>
                 <w:b/>
                 <w:bCs/>
+                <w:strike/>
               </w:rPr>
               <w:t xml:space="preserve">Wi-Fi: the firmware's</w:t>
+            </w:r>
+            <w:r>
+              <w:rPr>
+                <w:b/>
+                <w:bCs/>
+                <w:strike/>
+              </w:rPr>
+              <w:t xml:space="preserve"> </w:t>
+            </w:r>
+            <w:r>
+              <w:rPr>
+                <w:rStyle w:val="VerbatimChar"/>
+                <w:b/>
+                <w:bCs/>
+                <w:strike/>
+              </w:rPr>
+              <w:t xml:space="preserve">wsec</w:t>
+            </w:r>
+            <w:r>
+              <w:rPr>
+                <w:b/>
+                <w:bCs/>
+                <w:strike/>
+              </w:rPr>
+              <w:t xml:space="preserve"> </w:t>
+            </w:r>
+            <w:r>
+              <w:rPr>
+                <w:b/>
+                <w:bCs/>
+                <w:strike/>
+              </w:rPr>
+              <w:t xml:space="preserve">from the IE's ciphers</w:t>
+            </w:r>
+            <w:r>
+              <w:t xml:space="preserve"> </w:t>
+            </w:r>
+            <w:r>
+              <w:t xml:space="preserve">--</w:t>
+            </w:r>
+            <w:r>
+              <w:t xml:space="preserve"> </w:t>
             </w:r>
             <w:r>
               <w:rPr>
                 <w:b/>
                 <w:bCs/>
               </w:rPr>
+              <w:t xml:space="preserve">reverted</w:t>
+            </w:r>
+            <w:r>
+              <w:t xml:space="preserve"> </w:t>
+            </w:r>
+            <w:r>
+              <w:t xml:space="preserve">(2026-10-01, Circle</w:t>
+            </w:r>
+            <w:r>
               <w:t xml:space="preserve"> </w:t>
             </w:r>
             <w:r>
               <w:rPr>
                 <w:rStyle w:val="VerbatimChar"/>
-                <w:b/>
-                <w:bCs/>
+              </w:rPr>
+              <w:t xml:space="preserve">daff21f</w:t>
+            </w:r>
+            <w:r>
+              <w:t xml:space="preserve">): with it the user's WPA2-PSK network no longer came up; back to upstream's fixed</w:t>
+            </w:r>
+            <w:r>
+              <w:t xml:space="preserve"> </w:t>
+            </w:r>
+            <w:r>
+              <w:rPr>
+                <w:rStyle w:val="VerbatimChar"/>
               </w:rPr>
               <w:t xml:space="preserve">wsec</w:t>
             </w:r>
             <w:r>
-              <w:rPr>
-                <w:b/>
-                <w:bCs/>
-              </w:rPr>
               <w:t xml:space="preserve"> </w:t>
             </w:r>
             <w:r>
-              <w:rPr>
-                <w:b/>
-                <w:bCs/>
-              </w:rPr>
-              <w:t xml:space="preserve">from the IE's ciphers</w:t>
-            </w:r>
-            <w:r>
-              <w:t xml:space="preserve"> </w:t>
-            </w:r>
-            <w:r>
-              <w:t xml:space="preserve">(group + pairwise: TKIP 2, AES 4, as Linux's brcmfmac) -- WPA2 was always "aes": a WPA/WPA2 mixed-mode network (pairwise CCMP, group TKIP, common on 2.4 GHz) associated but no broadcast was decoded (no DHCP offer: the link stayed down)</w:t>
+              <w:t xml:space="preserve">(aes for WPA2, tkip for WPA). A WPA/WPA2 mixed-mode network (group TKIP) may again associate without an address</w:t>
             </w:r>
           </w:p>
         </w:tc>
@@ -2303,33 +2351,6 @@
                 <w:rStyle w:val="VerbatimChar"/>
               </w:rPr>
               <w:t xml:space="preserve">addon/wlan/ether4330.c</w:t>
-            </w:r>
-            <w:r>
-              <w:t xml:space="preserve"> </w:t>
-            </w:r>
-            <w:r>
-              <w:t xml:space="preserve">(</w:t>
-            </w:r>
-            <w:r>
-              <w:rPr>
-                <w:rStyle w:val="VerbatimChar"/>
-              </w:rPr>
-              <w:t xml:space="preserve">iewsec</w:t>
-            </w:r>
-            <w:r>
-              <w:t xml:space="preserve">,</w:t>
-            </w:r>
-            <w:r>
-              <w:t xml:space="preserve"> </w:t>
-            </w:r>
-            <w:r>
-              <w:rPr>
-                <w:rStyle w:val="VerbatimChar"/>
-              </w:rPr>
-              <w:t xml:space="preserve">setauth</w:t>
-            </w:r>
-            <w:r>
-              <w:t xml:space="preserve">)</w:t>
             </w:r>
           </w:p>
         </w:tc>

</xml_diff>

<commit_message>
Wi-Fi: the cipher change back (Circle b357fa5); the kernel rebuilt and staged
The network that did not come up was missing its firmware file (sdcard_lite's .bin,
then ignored by git), not Circle's 6f3542b: its revert undone. docs 04 / 05 as before.

Co-Authored-By: Claude Opus 5.5 <noreply@anthropic.com>
Claude-Session: https://claude.ai/code/session_018vcYqFmwcdMsmNMcVF62sL
</commit_message>
<xml_diff>
--- a/docs/exports/05-CIRCLE-CHANGES.docx
+++ b/docs/exports/05-CIRCLE-CHANGES.docx
@@ -2252,7 +2252,6 @@
               <w:rPr>
                 <w:b/>
                 <w:bCs/>
-                <w:strike/>
               </w:rPr>
               <w:t xml:space="preserve">Wi-Fi: the firmware's</w:t>
             </w:r>
@@ -2260,7 +2259,6 @@
               <w:rPr>
                 <w:b/>
                 <w:bCs/>
-                <w:strike/>
               </w:rPr>
               <w:t xml:space="preserve"> </w:t>
             </w:r>
@@ -2269,74 +2267,28 @@
                 <w:rStyle w:val="VerbatimChar"/>
                 <w:b/>
                 <w:bCs/>
-                <w:strike/>
               </w:rPr>
               <w:t xml:space="preserve">wsec</w:t>
-            </w:r>
-            <w:r>
-              <w:rPr>
-                <w:b/>
-                <w:bCs/>
-                <w:strike/>
-              </w:rPr>
-              <w:t xml:space="preserve"> </w:t>
-            </w:r>
-            <w:r>
-              <w:rPr>
-                <w:b/>
-                <w:bCs/>
-                <w:strike/>
-              </w:rPr>
-              <w:t xml:space="preserve">from the IE's ciphers</w:t>
-            </w:r>
-            <w:r>
-              <w:t xml:space="preserve"> </w:t>
-            </w:r>
-            <w:r>
-              <w:t xml:space="preserve">--</w:t>
-            </w:r>
-            <w:r>
-              <w:t xml:space="preserve"> </w:t>
             </w:r>
             <w:r>
               <w:rPr>
                 <w:b/>
                 <w:bCs/>
               </w:rPr>
-              <w:t xml:space="preserve">reverted</w:t>
-            </w:r>
-            <w:r>
               <w:t xml:space="preserve"> </w:t>
             </w:r>
             <w:r>
-              <w:t xml:space="preserve">(2026-10-01, Circle</w:t>
+              <w:rPr>
+                <w:b/>
+                <w:bCs/>
+              </w:rPr>
+              <w:t xml:space="preserve">from the IE's ciphers</w:t>
             </w:r>
             <w:r>
               <w:t xml:space="preserve"> </w:t>
             </w:r>
             <w:r>
-              <w:rPr>
-                <w:rStyle w:val="VerbatimChar"/>
-              </w:rPr>
-              <w:t xml:space="preserve">daff21f</w:t>
-            </w:r>
-            <w:r>
-              <w:t xml:space="preserve">): with it the user's WPA2-PSK network no longer came up; back to upstream's fixed</w:t>
-            </w:r>
-            <w:r>
-              <w:t xml:space="preserve"> </w:t>
-            </w:r>
-            <w:r>
-              <w:rPr>
-                <w:rStyle w:val="VerbatimChar"/>
-              </w:rPr>
-              <w:t xml:space="preserve">wsec</w:t>
-            </w:r>
-            <w:r>
-              <w:t xml:space="preserve"> </w:t>
-            </w:r>
-            <w:r>
-              <w:t xml:space="preserve">(aes for WPA2, tkip for WPA). A WPA/WPA2 mixed-mode network (group TKIP) may again associate without an address</w:t>
+              <w:t xml:space="preserve">(group + pairwise: TKIP 2, AES 4, as Linux's brcmfmac) -- WPA2 was always "aes": a WPA/WPA2 mixed-mode network (pairwise CCMP, group TKIP, common on 2.4 GHz) associated but no broadcast was decoded (no DHCP offer: the link stayed down)</w:t>
             </w:r>
           </w:p>
         </w:tc>
@@ -2351,6 +2303,33 @@
                 <w:rStyle w:val="VerbatimChar"/>
               </w:rPr>
               <w:t xml:space="preserve">addon/wlan/ether4330.c</w:t>
+            </w:r>
+            <w:r>
+              <w:t xml:space="preserve"> </w:t>
+            </w:r>
+            <w:r>
+              <w:t xml:space="preserve">(</w:t>
+            </w:r>
+            <w:r>
+              <w:rPr>
+                <w:rStyle w:val="VerbatimChar"/>
+              </w:rPr>
+              <w:t xml:space="preserve">iewsec</w:t>
+            </w:r>
+            <w:r>
+              <w:t xml:space="preserve">,</w:t>
+            </w:r>
+            <w:r>
+              <w:t xml:space="preserve"> </w:t>
+            </w:r>
+            <w:r>
+              <w:rPr>
+                <w:rStyle w:val="VerbatimChar"/>
+              </w:rPr>
+              <w:t xml:space="preserve">setauth</w:t>
+            </w:r>
+            <w:r>
+              <w:t xml:space="preserve">)</w:t>
             </w:r>
           </w:p>
         </w:tc>

</xml_diff>

<commit_message>
USB volumes named by the user: USB1: a device whole (one partition or none), USB1P1:, USB1P2:... its partitions when it has several, USB: an alias of USB1:
The kernel reads a device's sector 0 (a boot sector, or an MBR of several partitions) and mounts USBn or
its USBnPm; one FatFs lock a physical drive; the eject acts on the whole device; a format of USBn makes it
one partition again, of USBnPm only that partition (Disks: Whole device). The menu bar's box groups a
device's partitions under one button; the File Viewer, the file dialogs, Photos and eject know the names.
Tests: usbtest (two partitions), the images' keys. Docs 02 §18, 03, 04, 05 §28.

Co-Authored-By: Claude Opus 5.5 <noreply@anthropic.com>
Claude-Session: https://claude.ai/code/session_019swJDCUhMbX62nsKhgL9Te
</commit_message>
<xml_diff>
--- a/docs/exports/05-CIRCLE-CHANGES.docx
+++ b/docs/exports/05-CIRCLE-CHANGES.docx
@@ -10400,7 +10400,61 @@
         <w:t xml:space="preserve">FF_VOLUME_STRS "SD","SD1","SD2","SD3","USB","USB2","USB3","FD","NVME"</w:t>
       </w:r>
       <w:r>
-        <w:t xml:space="preserve">;</w:t>
+        <w:t xml:space="preserve"> </w:t>
+      </w:r>
+      <w:r>
+        <w:t xml:space="preserve">(since</w:t>
+      </w:r>
+      <w:r>
+        <w:t xml:space="preserve"> </w:t>
+      </w:r>
+      <w:r>
+        <w:t xml:space="preserve">§28: 21 volumes, the USB devices'</w:t>
+      </w:r>
+      <w:r>
+        <w:t xml:space="preserve"> </w:t>
+      </w:r>
+      <w:r>
+        <w:rPr>
+          <w:rStyle w:val="VerbatimChar"/>
+        </w:rPr>
+        <w:t xml:space="preserve">USB1</w:t>
+      </w:r>
+      <w:r>
+        <w:t xml:space="preserve">..</w:t>
+      </w:r>
+      <w:r>
+        <w:rPr>
+          <w:rStyle w:val="VerbatimChar"/>
+        </w:rPr>
+        <w:t xml:space="preserve">USB3</w:t>
+      </w:r>
+      <w:r>
+        <w:t xml:space="preserve"> </w:t>
+      </w:r>
+      <w:r>
+        <w:t xml:space="preserve">and their partitions</w:t>
+      </w:r>
+      <w:r>
+        <w:t xml:space="preserve"> </w:t>
+      </w:r>
+      <w:r>
+        <w:rPr>
+          <w:rStyle w:val="VerbatimChar"/>
+        </w:rPr>
+        <w:t xml:space="preserve">USB1P1</w:t>
+      </w:r>
+      <w:r>
+        <w:t xml:space="preserve">..</w:t>
+      </w:r>
+      <w:r>
+        <w:rPr>
+          <w:rStyle w:val="VerbatimChar"/>
+        </w:rPr>
+        <w:t xml:space="preserve">USB3P4</w:t>
+      </w:r>
+      <w:r>
+        <w:t xml:space="preserve">);</w:t>
       </w:r>
       <w:r>
         <w:t xml:space="preserve"> </w:t>
@@ -17582,7 +17636,7 @@
         <w:rPr>
           <w:rStyle w:val="VerbatimChar"/>
         </w:rPr>
-        <w:t xml:space="preserve">USB:</w:t>
+        <w:t xml:space="preserve">USB1:</w:t>
       </w:r>
       <w:r>
         <w:t xml:space="preserve">,</w:t>
@@ -17612,7 +17666,19 @@
         <w:t xml:space="preserve"> </w:t>
       </w:r>
       <w:r>
-        <w:t xml:space="preserve">when they</w:t>
+        <w:t xml:space="preserve">(or</w:t>
+      </w:r>
+      <w:r>
+        <w:t xml:space="preserve"> </w:t>
+      </w:r>
+      <w:r>
+        <w:rPr>
+          <w:rStyle w:val="VerbatimChar"/>
+        </w:rPr>
+        <w:t xml:space="preserve">USB1P1:</w:t>
+      </w:r>
+      <w:r>
+        <w:t xml:space="preserve">… per partition) when they</w:t>
       </w:r>
       <w:r>
         <w:t xml:space="preserve"> </w:t>
@@ -18062,89 +18128,264 @@
       </w:pPr>
       <w:r>
         <w:rPr>
-          <w:rStyle w:val="VerbatimChar"/>
-        </w:rPr>
-        <w:t xml:space="preserve">diskio.cpp</w:t>
-      </w:r>
-      <w:r>
-        <w:t xml:space="preserve">: after each transfer with a drive other than the SD card (</w:t>
-      </w:r>
-      <w:r>
-        <w:rPr>
-          <w:rStyle w:val="VerbatimChar"/>
-        </w:rPr>
-        <w:t xml:space="preserve">pdrv != 0</w:t>
-      </w:r>
-      <w:r>
-        <w:t xml:space="preserve">), the weak hook</w:t>
-      </w:r>
-      <w:r>
-        <w:t xml:space="preserve"> </w:t>
-      </w:r>
-      <w:r>
-        <w:rPr>
-          <w:rStyle w:val="VerbatimChar"/>
           <w:bCs/>
           <w:b/>
         </w:rPr>
-        <w:t xml:space="preserve">OnyxDriverPoll</w:t>
-      </w:r>
-      <w:r>
-        <w:t xml:space="preserve"> </w:t>
-      </w:r>
-      <w:r>
-        <w:t xml:space="preserve">(the kernel's, §7b: it yields once the task has run 10 ms). The USB driver waits in a</w:t>
-      </w:r>
-      <w:r>
-        <w:t xml:space="preserve"> </w:t>
-      </w:r>
-      <w:r>
-        <w:t xml:space="preserve">busy loop (</w:t>
-      </w:r>
-      <w:r>
-        <w:rPr>
-          <w:rStyle w:val="VerbatimChar"/>
-        </w:rPr>
-        <w:t xml:space="preserve">NO_BUSY_WAIT</w:t>
-      </w:r>
-      <w:r>
-        <w:t xml:space="preserve"> </w:t>
-      </w:r>
-      <w:r>
-        <w:t xml:space="preserve">off): a format, a big folder kept core 0 for seconds. Between two transfers is a</w:t>
-      </w:r>
-      <w:r>
-        <w:t xml:space="preserve"> </w:t>
-      </w:r>
-      <w:r>
-        <w:t xml:space="preserve">safe point: the volume lock is held, and a device removed meanwhile only fails the next transfer</w:t>
-      </w:r>
-      <w:r>
-        <w:t xml:space="preserve"> </w:t>
-      </w:r>
-      <w:r>
-        <w:t xml:space="preserve">(</w:t>
-      </w:r>
-      <w:r>
-        <w:rPr>
-          <w:rStyle w:val="VerbatimChar"/>
-        </w:rPr>
-        <w:t xml:space="preserve">disk_removed</w:t>
-      </w:r>
-      <w:r>
-        <w:t xml:space="preserve"> </w:t>
-      </w:r>
-      <w:r>
-        <w:t xml:space="preserve">cleared</w:t>
-      </w:r>
-      <w:r>
-        <w:t xml:space="preserve"> </w:t>
-      </w:r>
-      <w:r>
-        <w:rPr>
-          <w:rStyle w:val="VerbatimChar"/>
-        </w:rPr>
-        <w:t xml:space="preserve">s_pVolume</w:t>
+        <w:t xml:space="preserve">The USB devices' partitions</w:t>
+      </w:r>
+      <w:r>
+        <w:t xml:space="preserve"> </w:t>
+      </w:r>
+      <w:r>
+        <w:t xml:space="preserve">(the user's naming, 2026-10-06):</w:t>
+      </w:r>
+      <w:r>
+        <w:t xml:space="preserve"> </w:t>
+      </w:r>
+      <w:r>
+        <w:rPr>
+          <w:rStyle w:val="VerbatimChar"/>
+        </w:rPr>
+        <w:t xml:space="preserve">ffconf.h</w:t>
+      </w:r>
+      <w:r>
+        <w:t xml:space="preserve"> </w:t>
+      </w:r>
+      <w:r>
+        <w:rPr>
+          <w:rStyle w:val="VerbatimChar"/>
+          <w:bCs/>
+          <w:b/>
+        </w:rPr>
+        <w:t xml:space="preserve">FF_VOLUMES 21</w:t>
+      </w:r>
+      <w:r>
+        <w:t xml:space="preserve">, the strings</w:t>
+      </w:r>
+      <w:r>
+        <w:t xml:space="preserve"> </w:t>
+      </w:r>
+      <w:r>
+        <w:rPr>
+          <w:rStyle w:val="VerbatimChar"/>
+        </w:rPr>
+        <w:t xml:space="preserve">"SD","SD1","SD2","SD3", "USB1","USB1P1".."USB1P4", "USB2",.., "USB3",.."USB3P4", "FD","NVME"</w:t>
+      </w:r>
+      <w:r>
+        <w:t xml:space="preserve">;</w:t>
+      </w:r>
+      <w:r>
+        <w:t xml:space="preserve"> </w:t>
+      </w:r>
+      <w:r>
+        <w:rPr>
+          <w:rStyle w:val="VerbatimChar"/>
+        </w:rPr>
+        <w:t xml:space="preserve">diskio.cpp</w:t>
+      </w:r>
+      <w:r>
+        <w:t xml:space="preserve">'s</w:t>
+      </w:r>
+      <w:r>
+        <w:t xml:space="preserve"> </w:t>
+      </w:r>
+      <w:r>
+        <w:rPr>
+          <w:rStyle w:val="VerbatimChar"/>
+          <w:bCs/>
+          <w:b/>
+        </w:rPr>
+        <w:t xml:space="preserve">VolToPart</w:t>
+      </w:r>
+      <w:r>
+        <w:t xml:space="preserve">:</w:t>
+      </w:r>
+      <w:r>
+        <w:t xml:space="preserve"> </w:t>
+      </w:r>
+      <w:r>
+        <w:rPr>
+          <w:rStyle w:val="VerbatimChar"/>
+        </w:rPr>
+        <w:t xml:space="preserve">USBn</w:t>
+      </w:r>
+      <w:r>
+        <w:t xml:space="preserve"> </w:t>
+      </w:r>
+      <w:r>
+        <w:t xml:space="preserve">=</w:t>
+      </w:r>
+      <w:r>
+        <w:t xml:space="preserve"> </w:t>
+      </w:r>
+      <w:r>
+        <w:rPr>
+          <w:rStyle w:val="VerbatimChar"/>
+        </w:rPr>
+        <w:t xml:space="preserve">{n, 0}</w:t>
+      </w:r>
+      <w:r>
+        <w:t xml:space="preserve"> </w:t>
+      </w:r>
+      <w:r>
+        <w:t xml:space="preserve">(the device whole: its first FAT volume, a superfloppy or its only</w:t>
+      </w:r>
+      <w:r>
+        <w:t xml:space="preserve"> </w:t>
+      </w:r>
+      <w:r>
+        <w:t xml:space="preserve">partition),</w:t>
+      </w:r>
+      <w:r>
+        <w:t xml:space="preserve"> </w:t>
+      </w:r>
+      <w:r>
+        <w:rPr>
+          <w:rStyle w:val="VerbatimChar"/>
+        </w:rPr>
+        <w:t xml:space="preserve">USBnPm</w:t>
+      </w:r>
+      <w:r>
+        <w:t xml:space="preserve"> </w:t>
+      </w:r>
+      <w:r>
+        <w:t xml:space="preserve">=</w:t>
+      </w:r>
+      <w:r>
+        <w:t xml:space="preserve"> </w:t>
+      </w:r>
+      <w:r>
+        <w:rPr>
+          <w:rStyle w:val="VerbatimChar"/>
+        </w:rPr>
+        <w:t xml:space="preserve">{n, m}</w:t>
+      </w:r>
+      <w:r>
+        <w:t xml:space="preserve"> </w:t>
+      </w:r>
+      <w:r>
+        <w:t xml:space="preserve">(MBR partition m). The kernel mounts one or the other by the device's</w:t>
+      </w:r>
+      <w:r>
+        <w:t xml:space="preserve"> </w:t>
+      </w:r>
+      <w:r>
+        <w:t xml:space="preserve">sector 0 (docs/02 §18).</w:t>
+      </w:r>
+      <w:r>
+        <w:t xml:space="preserve"> </w:t>
+      </w:r>
+      <w:r>
+        <w:rPr>
+          <w:rStyle w:val="VerbatimChar"/>
+        </w:rPr>
+        <w:t xml:space="preserve">ff.c</w:t>
+      </w:r>
+      <w:r>
+        <w:t xml:space="preserve">: its check</w:t>
+      </w:r>
+      <w:r>
+        <w:t xml:space="preserve"> </w:t>
+      </w:r>
+      <w:r>
+        <w:rPr>
+          <w:rStyle w:val="VerbatimChar"/>
+          <w:bCs/>
+          <w:b/>
+        </w:rPr>
+        <w:t xml:space="preserve">FF_VOLUMES &lt;= 10</w:t>
+      </w:r>
+      <w:r>
+        <w:rPr>
+          <w:bCs/>
+          <w:b/>
+        </w:rPr>
+        <w:t xml:space="preserve"> </w:t>
+      </w:r>
+      <w:r>
+        <w:rPr>
+          <w:bCs/>
+          <w:b/>
+        </w:rPr>
+        <w:t xml:space="preserve">lifted to 32</w:t>
+      </w:r>
+      <w:r>
+        <w:t xml:space="preserve"> </w:t>
+      </w:r>
+      <w:r>
+        <w:t xml:space="preserve">— it only guards the numeric</w:t>
+      </w:r>
+      <w:r>
+        <w:t xml:space="preserve"> </w:t>
+      </w:r>
+      <w:r>
+        <w:rPr>
+          <w:rStyle w:val="VerbatimChar"/>
+        </w:rPr>
+        <w:t xml:space="preserve">0:</w:t>
+      </w:r>
+      <w:r>
+        <w:t xml:space="preserve">..</w:t>
+      </w:r>
+      <w:r>
+        <w:rPr>
+          <w:rStyle w:val="VerbatimChar"/>
+        </w:rPr>
+        <w:t xml:space="preserve">9:</w:t>
+      </w:r>
+      <w:r>
+        <w:t xml:space="preserve"> </w:t>
+      </w:r>
+      <w:r>
+        <w:t xml:space="preserve">form (</w:t>
+      </w:r>
+      <w:r>
+        <w:rPr>
+          <w:rStyle w:val="VerbatimChar"/>
+        </w:rPr>
+        <w:t xml:space="preserve">get_ldnumber</w:t>
+      </w:r>
+      <w:r>
+        <w:t xml:space="preserve"> </w:t>
+      </w:r>
+      <w:r>
+        <w:t xml:space="preserve">reads one digit), which Onyx does not use; the volumes are reached by name.</w:t>
+      </w:r>
+      <w:r>
+        <w:t xml:space="preserve"> </w:t>
+      </w:r>
+      <w:r>
+        <w:t xml:space="preserve">The structures do not change (no clean rebuild;</w:t>
+      </w:r>
+      <w:r>
+        <w:t xml:space="preserve"> </w:t>
+      </w:r>
+      <w:r>
+        <w:rPr>
+          <w:rStyle w:val="VerbatimChar"/>
+        </w:rPr>
+        <w:t xml:space="preserve">tools/tests/run_fs_test.sh</w:t>
+      </w:r>
+      <w:r>
+        <w:t xml:space="preserve"> </w:t>
+      </w:r>
+      <w:r>
+        <w:t xml:space="preserve">lifts the same check in its copy</w:t>
+      </w:r>
+      <w:r>
+        <w:t xml:space="preserve"> </w:t>
+      </w:r>
+      <w:r>
+        <w:t xml:space="preserve">of upstream's</w:t>
+      </w:r>
+      <w:r>
+        <w:t xml:space="preserve"> </w:t>
+      </w:r>
+      <w:r>
+        <w:rPr>
+          <w:rStyle w:val="VerbatimChar"/>
+        </w:rPr>
+        <w:t xml:space="preserve">ff.c</w:t>
       </w:r>
       <w:r>
         <w:t xml:space="preserve">).</w:t>
@@ -18162,6 +18403,122 @@
         <w:rPr>
           <w:rStyle w:val="VerbatimChar"/>
         </w:rPr>
+        <w:t xml:space="preserve">diskio.cpp</w:t>
+      </w:r>
+      <w:r>
+        <w:t xml:space="preserve">: after each transfer with a drive other than the SD card (</w:t>
+      </w:r>
+      <w:r>
+        <w:rPr>
+          <w:rStyle w:val="VerbatimChar"/>
+        </w:rPr>
+        <w:t xml:space="preserve">pdrv != 0</w:t>
+      </w:r>
+      <w:r>
+        <w:t xml:space="preserve">), the weak hook</w:t>
+      </w:r>
+      <w:r>
+        <w:t xml:space="preserve"> </w:t>
+      </w:r>
+      <w:r>
+        <w:rPr>
+          <w:rStyle w:val="VerbatimChar"/>
+          <w:bCs/>
+          <w:b/>
+        </w:rPr>
+        <w:t xml:space="preserve">OnyxDriverPoll</w:t>
+      </w:r>
+      <w:r>
+        <w:t xml:space="preserve"> </w:t>
+      </w:r>
+      <w:r>
+        <w:t xml:space="preserve">(the kernel's, §7b: it yields once the task has run 10 ms). The USB driver waits in a</w:t>
+      </w:r>
+      <w:r>
+        <w:t xml:space="preserve"> </w:t>
+      </w:r>
+      <w:r>
+        <w:t xml:space="preserve">busy loop (</w:t>
+      </w:r>
+      <w:r>
+        <w:rPr>
+          <w:rStyle w:val="VerbatimChar"/>
+        </w:rPr>
+        <w:t xml:space="preserve">NO_BUSY_WAIT</w:t>
+      </w:r>
+      <w:r>
+        <w:t xml:space="preserve"> </w:t>
+      </w:r>
+      <w:r>
+        <w:t xml:space="preserve">off): a format, a big folder kept core 0 for seconds. Between two transfers is a</w:t>
+      </w:r>
+      <w:r>
+        <w:t xml:space="preserve"> </w:t>
+      </w:r>
+      <w:r>
+        <w:t xml:space="preserve">safe point: the drive's lock is held (the kernel's</w:t>
+      </w:r>
+      <w:r>
+        <w:t xml:space="preserve"> </w:t>
+      </w:r>
+      <w:r>
+        <w:rPr>
+          <w:rStyle w:val="VerbatimChar"/>
+        </w:rPr>
+        <w:t xml:space="preserve">fslock.cpp</w:t>
+      </w:r>
+      <w:r>
+        <w:t xml:space="preserve">: one lock per physical drive, so one for all</w:t>
+      </w:r>
+      <w:r>
+        <w:t xml:space="preserve"> </w:t>
+      </w:r>
+      <w:r>
+        <w:t xml:space="preserve">the volumes of a USB device), it is called once the bounce buffer and the sector cache are done with, and a</w:t>
+      </w:r>
+      <w:r>
+        <w:t xml:space="preserve"> </w:t>
+      </w:r>
+      <w:r>
+        <w:t xml:space="preserve">device removed meanwhile only fails the next transfer (</w:t>
+      </w:r>
+      <w:r>
+        <w:rPr>
+          <w:rStyle w:val="VerbatimChar"/>
+        </w:rPr>
+        <w:t xml:space="preserve">disk_removed</w:t>
+      </w:r>
+      <w:r>
+        <w:t xml:space="preserve"> </w:t>
+      </w:r>
+      <w:r>
+        <w:t xml:space="preserve">cleared</w:t>
+      </w:r>
+      <w:r>
+        <w:t xml:space="preserve"> </w:t>
+      </w:r>
+      <w:r>
+        <w:rPr>
+          <w:rStyle w:val="VerbatimChar"/>
+        </w:rPr>
+        <w:t xml:space="preserve">s_pVolume</w:t>
+      </w:r>
+      <w:r>
+        <w:t xml:space="preserve">).</w:t>
+      </w:r>
+    </w:p>
+    <w:p>
+      <w:pPr>
+        <w:numPr>
+          <w:ilvl w:val="0"/>
+          <w:numId w:val="1011"/>
+        </w:numPr>
+        <w:pStyle w:val="Compact"/>
+      </w:pPr>
+      <w:r>
+        <w:rPr>
+          <w:rStyle w:val="VerbatimChar"/>
+        </w:rPr>
         <w:t xml:space="preserve">usbmassdevice.{h,cpp}</w:t>
       </w:r>
       <w:r>
@@ -18317,10 +18674,49 @@
         <w:rPr>
           <w:rStyle w:val="VerbatimChar"/>
         </w:rPr>
-        <w:t xml:space="preserve">USB:</w:t>
-      </w:r>
-      <w:r>
-        <w:t xml:space="preserve">'s auto search, labels set and read; a stick pulled out while</w:t>
+        <w:t xml:space="preserve">USB1:</w:t>
+      </w:r>
+      <w:r>
+        <w:t xml:space="preserve">'s auto search; a device of two partitions (</w:t>
+      </w:r>
+      <w:r>
+        <w:rPr>
+          <w:rStyle w:val="VerbatimChar"/>
+        </w:rPr>
+        <w:t xml:space="preserve">USB1P1:</w:t>
+      </w:r>
+      <w:r>
+        <w:t xml:space="preserve"> </w:t>
+      </w:r>
+      <w:r>
+        <w:t xml:space="preserve">FAT32,</w:t>
+      </w:r>
+      <w:r>
+        <w:t xml:space="preserve"> </w:t>
+      </w:r>
+      <w:r>
+        <w:rPr>
+          <w:rStyle w:val="VerbatimChar"/>
+        </w:rPr>
+        <w:t xml:space="preserve">USB1P2:</w:t>
+      </w:r>
+      <w:r>
+        <w:t xml:space="preserve"> </w:t>
+      </w:r>
+      <w:r>
+        <w:t xml:space="preserve">exFAT) then made one again by a format of</w:t>
+      </w:r>
+      <w:r>
+        <w:t xml:space="preserve"> </w:t>
+      </w:r>
+      <w:r>
+        <w:rPr>
+          <w:rStyle w:val="VerbatimChar"/>
+        </w:rPr>
+        <w:t xml:space="preserve">USB1:</w:t>
+      </w:r>
+      <w:r>
+        <w:t xml:space="preserve">, labels set and read; a stick pulled out while</w:t>
       </w:r>
       <w:r>
         <w:t xml:space="preserve"> </w:t>

</xml_diff>

<commit_message>
Packages: onyx 2026.10.138 (the kernel on Circle 51.1.1, the scheduler's lost-wakeup fix) and the programs rebuilt from main (pkgman 1.0.32, ...)
Co-Authored-By: Claude Opus 5.5 <noreply@anthropic.com>
Claude-Session: https://claude.ai/code/session_01NVTBGsTejLZor1Spptroyo
</commit_message>
<xml_diff>
--- a/docs/exports/05-CIRCLE-CHANGES.docx
+++ b/docs/exports/05-CIRCLE-CHANGES.docx
@@ -202,25 +202,56 @@
           <w:bCs/>
           <w:b/>
         </w:rPr>
+        <w:t xml:space="preserve">Step51.1.1</w:t>
+      </w:r>
+      <w:r>
+        <w:t xml:space="preserve"> </w:t>
+      </w:r>
+      <w:r>
+        <w:t xml:space="preserve">(remote</w:t>
+      </w:r>
+      <w:r>
+        <w:t xml:space="preserve"> </w:t>
+      </w:r>
+      <w:r>
+        <w:rPr>
+          <w:rStyle w:val="VerbatimChar"/>
+        </w:rPr>
+        <w:t xml:space="preserve">upstream</w:t>
+      </w:r>
+      <w:r>
+        <w:t xml:space="preserve">) —</w:t>
+      </w:r>
+      <w:r>
+        <w:t xml:space="preserve"> </w:t>
+      </w:r>
+      <w:r>
+        <w:rPr>
+          <w:rStyle w:val="VerbatimChar"/>
+        </w:rPr>
         <w:t xml:space="preserve">Step51</w:t>
       </w:r>
       <w:r>
         <w:t xml:space="preserve"> </w:t>
       </w:r>
       <w:r>
-        <w:t xml:space="preserve">(remote</w:t>
-      </w:r>
-      <w:r>
-        <w:t xml:space="preserve"> </w:t>
-      </w:r>
-      <w:r>
-        <w:rPr>
-          <w:rStyle w:val="VerbatimChar"/>
-        </w:rPr>
-        <w:t xml:space="preserve">upstream</w:t>
-      </w:r>
-      <w:r>
-        <w:t xml:space="preserve">).</w:t>
+        <w:t xml:space="preserve">until 2026-10-09, when upstream's 51.1 and 51.1.1 were merged in (see</w:t>
+      </w:r>
+      <w:r>
+        <w:t xml:space="preserve"> </w:t>
+      </w:r>
+      <w:r>
+        <w:rPr>
+          <w:iCs/>
+          <w:i/>
+        </w:rPr>
+        <w:t xml:space="preserve">Upstream merges</w:t>
+      </w:r>
+      <w:r>
+        <w:t xml:space="preserve"> </w:t>
+      </w:r>
+      <w:r>
+        <w:t xml:space="preserve">below).</w:t>
       </w:r>
     </w:p>
     <w:p>
@@ -267,28 +298,7 @@
         <w:pStyle w:val="FirstParagraph"/>
       </w:pPr>
       <w:r>
-        <w:t xml:space="preserve">The patches on top of</w:t>
-      </w:r>
-      <w:r>
-        <w:t xml:space="preserve"> </w:t>
-      </w:r>
-      <w:r>
-        <w:rPr>
-          <w:rStyle w:val="VerbatimChar"/>
-        </w:rPr>
-        <w:t xml:space="preserve">Step51</w:t>
-      </w:r>
-      <w:r>
-        <w:t xml:space="preserve"> </w:t>
-      </w:r>
-      <w:r>
-        <w:t xml:space="preserve">are small and surgical. The diffs below are the exact output</w:t>
-      </w:r>
-      <w:r>
-        <w:t xml:space="preserve"> </w:t>
-      </w:r>
-      <w:r>
-        <w:t xml:space="preserve">of</w:t>
+        <w:t xml:space="preserve">The patches on top of upstream are small and surgical. The diffs below are the output of</w:t>
       </w:r>
       <w:r>
         <w:t xml:space="preserve"> </w:t>
@@ -315,7 +325,28 @@
         <w:t xml:space="preserve">circle/</w:t>
       </w:r>
       <w:r>
-        <w:t xml:space="preserve">. To reproduce:</w:t>
+        <w:t xml:space="preserve"> </w:t>
+      </w:r>
+      <w:r>
+        <w:t xml:space="preserve">at the time each was written (since the merge of 51.1.1, compare</w:t>
+      </w:r>
+      <w:r>
+        <w:t xml:space="preserve"> </w:t>
+      </w:r>
+      <w:r>
+        <w:t xml:space="preserve">with</w:t>
+      </w:r>
+      <w:r>
+        <w:t xml:space="preserve"> </w:t>
+      </w:r>
+      <w:r>
+        <w:rPr>
+          <w:rStyle w:val="VerbatimChar"/>
+        </w:rPr>
+        <w:t xml:space="preserve">Step51.1.1</w:t>
+      </w:r>
+      <w:r>
+        <w:t xml:space="preserve">). To reproduce:</w:t>
       </w:r>
     </w:p>
     <w:p>
@@ -401,7 +432,19 @@
         <w:rPr>
           <w:rStyle w:val="NormalTok"/>
         </w:rPr>
-        <w:t xml:space="preserve"> Step51..onyx</w:t>
+        <w:t xml:space="preserve"> </w:t>
+      </w:r>
+      <w:r>
+        <w:rPr>
+          <w:rStyle w:val="AttributeTok"/>
+        </w:rPr>
+        <w:t xml:space="preserve">--no-merges</w:t>
+      </w:r>
+      <w:r>
+        <w:rPr>
+          <w:rStyle w:val="NormalTok"/>
+        </w:rPr>
+        <w:t xml:space="preserve"> Step51.1.1..onyx</w:t>
       </w:r>
       <w:r>
         <w:br/>
@@ -428,7 +471,7 @@
         <w:rPr>
           <w:rStyle w:val="NormalTok"/>
         </w:rPr>
-        <w:t xml:space="preserve"> circle diff Step51..onyx</w:t>
+        <w:t xml:space="preserve"> circle diff Step51.1.1..onyx</w:t>
       </w:r>
     </w:p>
     <w:p>
@@ -19232,7 +19275,382 @@
       </w:r>
     </w:p>
     <w:bookmarkEnd w:id="56"/>
-    <w:bookmarkStart w:id="57" w:name="updating-the-fork-submodule"/>
+    <w:bookmarkStart w:id="57" w:name="upstream-merges"/>
+    <w:p>
+      <w:pPr>
+        <w:pStyle w:val="Heading2"/>
+      </w:pPr>
+      <w:r>
+        <w:t xml:space="preserve">Upstream merges</w:t>
+      </w:r>
+    </w:p>
+    <w:p>
+      <w:pPr>
+        <w:pStyle w:val="FirstParagraph"/>
+      </w:pPr>
+      <w:r>
+        <w:rPr>
+          <w:bCs/>
+          <w:b/>
+        </w:rPr>
+        <w:t xml:space="preserve">2026-10-09: Circle 51.1 and 51.1.1</w:t>
+      </w:r>
+      <w:r>
+        <w:t xml:space="preserve"> </w:t>
+      </w:r>
+      <w:r>
+        <w:t xml:space="preserve">(84 upstream commits after</w:t>
+      </w:r>
+      <w:r>
+        <w:t xml:space="preserve"> </w:t>
+      </w:r>
+      <w:r>
+        <w:rPr>
+          <w:rStyle w:val="VerbatimChar"/>
+        </w:rPr>
+        <w:t xml:space="preserve">Step51</w:t>
+      </w:r>
+      <w:r>
+        <w:t xml:space="preserve">, merge</w:t>
+      </w:r>
+      <w:r>
+        <w:t xml:space="preserve"> </w:t>
+      </w:r>
+      <w:r>
+        <w:rPr>
+          <w:rStyle w:val="VerbatimChar"/>
+        </w:rPr>
+        <w:t xml:space="preserve">c06e5a52</w:t>
+      </w:r>
+      <w:r>
+        <w:t xml:space="preserve">). What Onyx gains:</w:t>
+      </w:r>
+      <w:r>
+        <w:t xml:space="preserve"> </w:t>
+      </w:r>
+      <w:r>
+        <w:t xml:space="preserve">the xHCI endpoint recovered from Halted after a transfer error (#704: the Pi 4's and the Pi 5's USB); transient HID</w:t>
+      </w:r>
+      <w:r>
+        <w:t xml:space="preserve"> </w:t>
+      </w:r>
+      <w:r>
+        <w:t xml:space="preserve">report errors tolerated, a generic HID mouse-shaped report taken as a mouse (#693); the 8BitDo controllers,</w:t>
+      </w:r>
+      <w:r>
+        <w:t xml:space="preserve"> </w:t>
+      </w:r>
+      <w:r>
+        <w:t xml:space="preserve">keyboards and Wireless Adapter 2, the Xbox 360 wireless receiver (and clones); Wi-Fi: the eero 7 routers (#696) and</w:t>
+      </w:r>
+      <w:r>
+        <w:t xml:space="preserve"> </w:t>
+      </w:r>
+      <w:r>
+        <w:t xml:space="preserve">the hidden networks (hostap at</w:t>
+      </w:r>
+      <w:r>
+        <w:t xml:space="preserve"> </w:t>
+      </w:r>
+      <w:r>
+        <w:rPr>
+          <w:rStyle w:val="VerbatimChar"/>
+        </w:rPr>
+        <w:t xml:space="preserve">circle-step51.1</w:t>
+      </w:r>
+      <w:r>
+        <w:t xml:space="preserve">); FatFs R0.16 patch 2 (the Onyx patches merged automatically:</w:t>
+      </w:r>
+      <w:r>
+        <w:t xml:space="preserve"> </w:t>
+      </w:r>
+      <w:r>
+        <w:rPr>
+          <w:rStyle w:val="VerbatimChar"/>
+        </w:rPr>
+        <w:t xml:space="preserve">tools/tests/run_fs_test.sh</w:t>
+      </w:r>
+      <w:r>
+        <w:t xml:space="preserve"> </w:t>
+      </w:r>
+      <w:r>
+        <w:t xml:space="preserve">passes); the lost wake-up of</w:t>
+      </w:r>
+      <w:r>
+        <w:t xml:space="preserve"> </w:t>
+      </w:r>
+      <w:r>
+        <w:rPr>
+          <w:rStyle w:val="VerbatimChar"/>
+        </w:rPr>
+        <w:t xml:space="preserve">CSynchronizationEvent</w:t>
+      </w:r>
+      <w:r>
+        <w:t xml:space="preserve"> </w:t>
+      </w:r>
+      <w:r>
+        <w:t xml:space="preserve">(</w:t>
+      </w:r>
+      <w:r>
+        <w:rPr>
+          <w:rStyle w:val="VerbatimChar"/>
+        </w:rPr>
+        <w:t xml:space="preserve">BlockTask</w:t>
+      </w:r>
+      <w:r>
+        <w:t xml:space="preserve"> </w:t>
+      </w:r>
+      <w:r>
+        <w:t xml:space="preserve">checks the state under</w:t>
+      </w:r>
+      <w:r>
+        <w:t xml:space="preserve"> </w:t>
+      </w:r>
+      <w:r>
+        <w:t xml:space="preserve">its lock) —</w:t>
+      </w:r>
+      <w:r>
+        <w:t xml:space="preserve"> </w:t>
+      </w:r>
+      <w:r>
+        <w:rPr>
+          <w:bCs/>
+          <w:b/>
+        </w:rPr>
+        <w:t xml:space="preserve">ported into Onyx's own scheduler</w:t>
+      </w:r>
+      <w:r>
+        <w:t xml:space="preserve"> </w:t>
+      </w:r>
+      <w:r>
+        <w:t xml:space="preserve">(</w:t>
+      </w:r>
+      <w:r>
+        <w:rPr>
+          <w:rStyle w:val="VerbatimChar"/>
+        </w:rPr>
+        <w:t xml:space="preserve">kernel/sched/scheduler.cpp</w:t>
+      </w:r>
+      <w:r>
+        <w:t xml:space="preserve">,</w:t>
+      </w:r>
+      <w:r>
+        <w:t xml:space="preserve"> </w:t>
+      </w:r>
+      <w:r>
+        <w:rPr>
+          <w:rStyle w:val="VerbatimChar"/>
+        </w:rPr>
+        <w:t xml:space="preserve">kernel/compat/circle/sched/scheduler.h</w:t>
+      </w:r>
+      <w:r>
+        <w:t xml:space="preserve">:</w:t>
+      </w:r>
+      <w:r>
+        <w:t xml:space="preserve"> </w:t>
+      </w:r>
+      <w:r>
+        <w:t xml:space="preserve">it replaces Circle's); for the Pi 5: the official DSI touchscreens (</w:t>
+      </w:r>
+      <w:r>
+        <w:rPr>
+          <w:rStyle w:val="VerbatimChar"/>
+        </w:rPr>
+        <w:t xml:space="preserve">addon/rp1dsi</w:t>
+      </w:r>
+      <w:r>
+        <w:t xml:space="preserve">), the RP1's I2C buses 4 and 6.</w:t>
+      </w:r>
+      <w:r>
+        <w:t xml:space="preserve"> </w:t>
+      </w:r>
+      <w:r>
+        <w:t xml:space="preserve">Upstream's DWHCI /</w:t>
+      </w:r>
+      <w:r>
+        <w:t xml:space="preserve"> </w:t>
+      </w:r>
+      <w:r>
+        <w:rPr>
+          <w:rStyle w:val="VerbatimChar"/>
+        </w:rPr>
+        <w:t xml:space="preserve">usbboost</w:t>
+      </w:r>
+      <w:r>
+        <w:t xml:space="preserve"> </w:t>
+      </w:r>
+      <w:r>
+        <w:t xml:space="preserve">/ USB-MIDI work is for the Pi 1-3 only.</w:t>
+      </w:r>
+      <w:r>
+        <w:t xml:space="preserve"> </w:t>
+      </w:r>
+      <w:r>
+        <w:t xml:space="preserve">Three conflicts:</w:t>
+      </w:r>
+      <w:r>
+        <w:t xml:space="preserve"> </w:t>
+      </w:r>
+      <w:r>
+        <w:rPr>
+          <w:rStyle w:val="VerbatimChar"/>
+        </w:rPr>
+        <w:t xml:space="preserve">usbkeyboard.h</w:t>
+      </w:r>
+      <w:r>
+        <w:t xml:space="preserve"> </w:t>
+      </w:r>
+      <w:r>
+        <w:t xml:space="preserve">(our</w:t>
+      </w:r>
+      <w:r>
+        <w:t xml:space="preserve"> </w:t>
+      </w:r>
+      <w:r>
+        <w:rPr>
+          <w:rStyle w:val="VerbatimChar"/>
+        </w:rPr>
+        <w:t xml:space="preserve">GetKeyMap ()</w:t>
+      </w:r>
+      <w:r>
+        <w:t xml:space="preserve"> </w:t>
+      </w:r>
+      <w:r>
+        <w:t xml:space="preserve">beside upstream's protected</w:t>
+      </w:r>
+      <w:r>
+        <w:t xml:space="preserve"> </w:t>
+      </w:r>
+      <w:r>
+        <w:rPr>
+          <w:rStyle w:val="VerbatimChar"/>
+        </w:rPr>
+        <w:t xml:space="preserve">ConfigureKeyboard</w:t>
+      </w:r>
+      <w:r>
+        <w:t xml:space="preserve">),</w:t>
+      </w:r>
+      <w:r>
+        <w:t xml:space="preserve"> </w:t>
+      </w:r>
+      <w:r>
+        <w:rPr>
+          <w:rStyle w:val="VerbatimChar"/>
+        </w:rPr>
+        <w:t xml:space="preserve">ether4330.c</w:t>
+      </w:r>
+      <w:r>
+        <w:t xml:space="preserve"> </w:t>
+      </w:r>
+      <w:r>
+        <w:t xml:space="preserve">(our scan kept — both bands, the configured networks probed by name — with upstream's directed probe</w:t>
+      </w:r>
+      <w:r>
+        <w:t xml:space="preserve"> </w:t>
+      </w:r>
+      <w:r>
+        <w:t xml:space="preserve">for a hidden network added as one more name),</w:t>
+      </w:r>
+      <w:r>
+        <w:t xml:space="preserve"> </w:t>
+      </w:r>
+      <w:r>
+        <w:rPr>
+          <w:rStyle w:val="VerbatimChar"/>
+        </w:rPr>
+        <w:t xml:space="preserve">tcpconnection.cpp</w:t>
+      </w:r>
+      <w:r>
+        <w:t xml:space="preserve"> </w:t>
+      </w:r>
+      <w:r>
+        <w:t xml:space="preserve">(our duplicate-ACK test kept: patch 20, the same</w:t>
+      </w:r>
+      <w:r>
+        <w:t xml:space="preserve"> </w:t>
+      </w:r>
+      <w:r>
+        <w:t xml:space="preserve">RFC 5681 test without resetting the count on another segment). The keymap decoupling (patch 1) came through intact.</w:t>
+      </w:r>
+      <w:r>
+        <w:t xml:space="preserve"> </w:t>
+      </w:r>
+      <w:r>
+        <w:t xml:space="preserve">Tested on the PC (</w:t>
+      </w:r>
+      <w:r>
+        <w:rPr>
+          <w:rStyle w:val="VerbatimChar"/>
+        </w:rPr>
+        <w:t xml:space="preserve">run_fs_test.sh</w:t>
+      </w:r>
+      <w:r>
+        <w:t xml:space="preserve">,</w:t>
+      </w:r>
+      <w:r>
+        <w:t xml:space="preserve"> </w:t>
+      </w:r>
+      <w:r>
+        <w:rPr>
+          <w:rStyle w:val="VerbatimChar"/>
+        </w:rPr>
+        <w:t xml:space="preserve">run_circlenet_test.sh</w:t>
+      </w:r>
+      <w:r>
+        <w:t xml:space="preserve">,</w:t>
+      </w:r>
+      <w:r>
+        <w:t xml:space="preserve"> </w:t>
+      </w:r>
+      <w:r>
+        <w:rPr>
+          <w:rStyle w:val="VerbatimChar"/>
+        </w:rPr>
+        <w:t xml:space="preserve">run_ramfs_test.sh</w:t>
+      </w:r>
+      <w:r>
+        <w:t xml:space="preserve">,</w:t>
+      </w:r>
+      <w:r>
+        <w:t xml:space="preserve"> </w:t>
+      </w:r>
+      <w:r>
+        <w:rPr>
+          <w:rStyle w:val="VerbatimChar"/>
+        </w:rPr>
+        <w:t xml:space="preserve">run_gui_test.sh</w:t>
+      </w:r>
+      <w:r>
+        <w:t xml:space="preserve">,</w:t>
+      </w:r>
+      <w:r>
+        <w:t xml:space="preserve"> </w:t>
+      </w:r>
+      <w:r>
+        <w:rPr>
+          <w:rStyle w:val="VerbatimChar"/>
+        </w:rPr>
+        <w:t xml:space="preserve">run_gamepad_test.sh</w:t>
+      </w:r>
+      <w:r>
+        <w:t xml:space="preserve">);</w:t>
+      </w:r>
+      <w:r>
+        <w:t xml:space="preserve"> </w:t>
+      </w:r>
+      <w:r>
+        <w:rPr>
+          <w:bCs/>
+          <w:b/>
+        </w:rPr>
+        <w:t xml:space="preserve">to test on the Pi</w:t>
+      </w:r>
+      <w:r>
+        <w:t xml:space="preserve">: the Wi-Fi join, TCP (FTP, VNC), USB keyboards, mice and gamepads.</w:t>
+      </w:r>
+    </w:p>
+    <w:bookmarkEnd w:id="57"/>
+    <w:bookmarkStart w:id="58" w:name="updating-the-fork-submodule"/>
     <w:p>
       <w:pPr>
         <w:pStyle w:val="Heading2"/>
@@ -19249,7 +19667,16 @@
         <w:rPr>
           <w:rStyle w:val="CommentTok"/>
         </w:rPr>
-        <w:t xml:space="preserve"># rebase the Onyx patches onto a newer upstream, inside the submodule:</w:t>
+        <w:t xml:space="preserve"># merge a newer upstream into the Onyx branch, inside the submodule (a merge, not a rebase: the</w:t>
+      </w:r>
+      <w:r>
+        <w:br/>
+      </w:r>
+      <w:r>
+        <w:rPr>
+          <w:rStyle w:val="CommentTok"/>
+        </w:rPr>
+        <w:t xml:space="preserve"># branch is published and the superproject pins its commits):</w:t>
       </w:r>
       <w:r>
         <w:br/>
@@ -19276,7 +19703,13 @@
         <w:rPr>
           <w:rStyle w:val="NormalTok"/>
         </w:rPr>
-        <w:t xml:space="preserve"> circle fetch upstream</w:t>
+        <w:t xml:space="preserve"> circle fetch upstream </w:t>
+      </w:r>
+      <w:r>
+        <w:rPr>
+          <w:rStyle w:val="AttributeTok"/>
+        </w:rPr>
+        <w:t xml:space="preserve">--tags</w:t>
       </w:r>
       <w:r>
         <w:br/>
@@ -19303,7 +19736,7 @@
         <w:rPr>
           <w:rStyle w:val="NormalTok"/>
         </w:rPr>
-        <w:t xml:space="preserve"> circle rebase upstream/master onyx     </w:t>
+        <w:t xml:space="preserve"> circle merge upstream/master            </w:t>
       </w:r>
       <w:r>
         <w:rPr>
@@ -19318,6 +19751,15 @@
         <w:rPr>
           <w:rStyle w:val="CommentTok"/>
         </w:rPr>
+        <w:t xml:space="preserve"># then the skill resync-circle-keymap-patch (the keymap decoupling), and the Pi 5's tree: sh tools/pi5/circle5.sh</w:t>
+      </w:r>
+      <w:r>
+        <w:br/>
+      </w:r>
+      <w:r>
+        <w:rPr>
+          <w:rStyle w:val="CommentTok"/>
+        </w:rPr>
         <w:t xml:space="preserve"># rebuild the affected libraries: libcircle (heap + page accounting), libinput (keymap)</w:t>
       </w:r>
       <w:r>
@@ -19387,7 +19829,7 @@
         <w:t xml:space="preserve">"Bump circle submodule"</w:t>
       </w:r>
     </w:p>
-    <w:bookmarkEnd w:id="57"/>
+    <w:bookmarkEnd w:id="58"/>
     <w:sectPr>
       <w:footerReference r:id="rId9" w:type="default"/>
       <w:footnotePr>

</xml_diff>

<commit_message>
docs/05: Circle 51.1.1 tested on the Pi 4 (Wi-Fi, TCP, the GBC emulator with sound)
Co-Authored-By: Claude Opus 5.5 <noreply@anthropic.com>
Claude-Session: https://claude.ai/code/session_01NVTBGsTejLZor1Spptroyo
</commit_message>
<xml_diff>
--- a/docs/exports/05-CIRCLE-CHANGES.docx
+++ b/docs/exports/05-CIRCLE-CHANGES.docx
@@ -19633,7 +19633,7 @@
         <w:t xml:space="preserve">run_gamepad_test.sh</w:t>
       </w:r>
       <w:r>
-        <w:t xml:space="preserve">);</w:t>
+        <w:t xml:space="preserve">).</w:t>
       </w:r>
       <w:r>
         <w:t xml:space="preserve"> </w:t>
@@ -19643,10 +19643,25 @@
           <w:bCs/>
           <w:b/>
         </w:rPr>
-        <w:t xml:space="preserve">to test on the Pi</w:t>
-      </w:r>
-      <w:r>
-        <w:t xml:space="preserve">: the Wi-Fi join, TCP (FTP, VNC), USB keyboards, mice and gamepads.</w:t>
+        <w:t xml:space="preserve">Tested on the Pi 4 (the user, 2026-10-09):</w:t>
+      </w:r>
+      <w:r>
+        <w:t xml:space="preserve"> </w:t>
+      </w:r>
+      <w:r>
+        <w:t xml:space="preserve">the Wi-Fi joins, TCP holds (YouTube audio</w:t>
+      </w:r>
+      <w:r>
+        <w:t xml:space="preserve"> </w:t>
+      </w:r>
+      <w:r>
+        <w:t xml:space="preserve">and video in Jet, a remote desktop session over rdpd), the Game Boy Color emulator plays with its sound. Not checked</w:t>
+      </w:r>
+      <w:r>
+        <w:t xml:space="preserve"> </w:t>
+      </w:r>
+      <w:r>
+        <w:t xml:space="preserve">yet: a keyboard unplugged and plugged again (its layout kept), the 8BitDo / Xbox 360 wireless devices.</w:t>
       </w:r>
     </w:p>
     <w:bookmarkEnd w:id="57"/>

</xml_diff>

<commit_message>
docs: the Raspberry Pi 3 / Zero 2 W porting study (docs/PI3-PORT.md); the exports regenerated
Co-Authored-By: Claude Opus 5.5 <noreply@anthropic.com>
Claude-Session: https://claude.ai/code/session_01NVTBGsTejLZor1Spptroyo
</commit_message>
<xml_diff>
--- a/docs/exports/05-CIRCLE-CHANGES.docx
+++ b/docs/exports/05-CIRCLE-CHANGES.docx
@@ -19195,13 +19195,13 @@
       </w:r>
     </w:p>
     <w:bookmarkEnd w:id="54"/>
-    <w:bookmarkStart w:id="56" w:name="contributions-to-upstream-circle"/>
+    <w:bookmarkStart w:id="55" w:name="Xbe51fd1a252362a28046ce5c066f62ff02bcefc"/>
     <w:p>
       <w:pPr>
         <w:pStyle w:val="Heading2"/>
       </w:pPr>
       <w:r>
-        <w:t xml:space="preserve">Contributions to upstream Circle</w:t>
+        <w:t xml:space="preserve">30. The net device chosen at run time</w:t>
       </w:r>
     </w:p>
     <w:p>
@@ -19209,6 +19209,280 @@
         <w:pStyle w:val="FirstParagraph"/>
       </w:pPr>
       <w:r>
+        <w:rPr>
+          <w:bCs/>
+          <w:b/>
+        </w:rPr>
+        <w:t xml:space="preserve">Why.</w:t>
+      </w:r>
+      <w:r>
+        <w:t xml:space="preserve"> </w:t>
+      </w:r>
+      <w:r>
+        <w:rPr>
+          <w:rStyle w:val="VerbatimChar"/>
+        </w:rPr>
+        <w:t xml:space="preserve">CNetSubSystem</w:t>
+      </w:r>
+      <w:r>
+        <w:t xml:space="preserve"> </w:t>
+      </w:r>
+      <w:r>
+        <w:t xml:space="preserve">is made once, in</w:t>
+      </w:r>
+      <w:r>
+        <w:t xml:space="preserve"> </w:t>
+      </w:r>
+      <w:r>
+        <w:rPr>
+          <w:rStyle w:val="VerbatimChar"/>
+        </w:rPr>
+        <w:t xml:space="preserve">CKernel</w:t>
+      </w:r>
+      <w:r>
+        <w:t xml:space="preserve">'s constructor, with its device type (Onyx: the WLAN). The</w:t>
+      </w:r>
+      <w:r>
+        <w:t xml:space="preserve"> </w:t>
+      </w:r>
+      <w:r>
+        <w:t xml:space="preserve">Pi 5 has Gigabit Ethernet (the RP1's MACB, which Circle drives): Onyx takes the cable when its link comes up at</w:t>
+      </w:r>
+      <w:r>
+        <w:t xml:space="preserve"> </w:t>
+      </w:r>
+      <w:r>
+        <w:t xml:space="preserve">boot, else the Wi-Fi (</w:t>
+      </w:r>
+      <w:r>
+        <w:rPr>
+          <w:rStyle w:val="VerbatimChar"/>
+        </w:rPr>
+        <w:t xml:space="preserve">system.ini</w:t>
+      </w:r>
+      <w:r>
+        <w:t xml:space="preserve"> </w:t>
+      </w:r>
+      <w:r>
+        <w:rPr>
+          <w:rStyle w:val="VerbatimChar"/>
+        </w:rPr>
+        <w:t xml:space="preserve">network = auto | ethernet | wlan</w:t>
+      </w:r>
+      <w:r>
+        <w:t xml:space="preserve">, docs/04) -- a choice made after the stack</w:t>
+      </w:r>
+      <w:r>
+        <w:t xml:space="preserve"> </w:t>
+      </w:r>
+      <w:r>
+        <w:t xml:space="preserve">is initialized, since the MACB is brought up by</w:t>
+      </w:r>
+      <w:r>
+        <w:t xml:space="preserve"> </w:t>
+      </w:r>
+      <w:r>
+        <w:rPr>
+          <w:rStyle w:val="VerbatimChar"/>
+        </w:rPr>
+        <w:t xml:space="preserve">CNetSubSystem::Initialize</w:t>
+      </w:r>
+      <w:r>
+        <w:t xml:space="preserve">.</w:t>
+      </w:r>
+    </w:p>
+    <w:p>
+      <w:pPr>
+        <w:pStyle w:val="BodyText"/>
+      </w:pPr>
+      <w:r>
+        <w:rPr>
+          <w:bCs/>
+          <w:b/>
+        </w:rPr>
+        <w:t xml:space="preserve">What.</w:t>
+      </w:r>
+      <w:r>
+        <w:t xml:space="preserve"> </w:t>
+      </w:r>
+      <w:r>
+        <w:rPr>
+          <w:rStyle w:val="VerbatimChar"/>
+        </w:rPr>
+        <w:t xml:space="preserve">CNetDeviceLayer::SetDeviceType (TNetDeviceType)</w:t>
+      </w:r>
+      <w:r>
+        <w:t xml:space="preserve"> </w:t>
+      </w:r>
+      <w:r>
+        <w:t xml:space="preserve">(</w:t>
+      </w:r>
+      <w:r>
+        <w:rPr>
+          <w:rStyle w:val="VerbatimChar"/>
+        </w:rPr>
+        <w:t xml:space="preserve">include/circle/net/netdevlayer.h</w:t>
+      </w:r>
+      <w:r>
+        <w:t xml:space="preserve">,</w:t>
+      </w:r>
+      <w:r>
+        <w:t xml:space="preserve"> </w:t>
+      </w:r>
+      <w:r>
+        <w:rPr>
+          <w:rStyle w:val="VerbatimChar"/>
+        </w:rPr>
+        <w:t xml:space="preserve">lib/net/netdevlayer.cpp</w:t>
+      </w:r>
+      <w:r>
+        <w:t xml:space="preserve">): the type set and the device forgotten, so the next</w:t>
+      </w:r>
+      <w:r>
+        <w:t xml:space="preserve"> </w:t>
+      </w:r>
+      <w:r>
+        <w:rPr>
+          <w:rStyle w:val="VerbatimChar"/>
+        </w:rPr>
+        <w:t xml:space="preserve">Process ()</w:t>
+      </w:r>
+      <w:r>
+        <w:t xml:space="preserve"> </w:t>
+      </w:r>
+      <w:r>
+        <w:t xml:space="preserve">looks it up again.</w:t>
+      </w:r>
+      <w:r>
+        <w:t xml:space="preserve"> </w:t>
+      </w:r>
+      <w:r>
+        <w:t xml:space="preserve">Called before the link is up (</w:t>
+      </w:r>
+      <w:r>
+        <w:rPr>
+          <w:rStyle w:val="VerbatimChar"/>
+        </w:rPr>
+        <w:t xml:space="preserve">CNetSubSystem::Process</w:t>
+      </w:r>
+      <w:r>
+        <w:t xml:space="preserve"> </w:t>
+      </w:r>
+      <w:r>
+        <w:t xml:space="preserve">starts the DHCP client on the first device running), so no</w:t>
+      </w:r>
+      <w:r>
+        <w:t xml:space="preserve"> </w:t>
+      </w:r>
+      <w:r>
+        <w:t xml:space="preserve">address was asked on the other one. The kernel (</w:t>
+      </w:r>
+      <w:r>
+        <w:rPr>
+          <w:rStyle w:val="VerbatimChar"/>
+        </w:rPr>
+        <w:t xml:space="preserve">kernel/kernel.cpp</w:t>
+      </w:r>
+      <w:r>
+        <w:t xml:space="preserve">,</w:t>
+      </w:r>
+      <w:r>
+        <w:t xml:space="preserve"> </w:t>
+      </w:r>
+      <w:r>
+        <w:rPr>
+          <w:rStyle w:val="VerbatimChar"/>
+        </w:rPr>
+        <w:t xml:space="preserve">CNetBringupTask</w:t>
+      </w:r>
+      <w:r>
+        <w:t xml:space="preserve">) calls it through</w:t>
+      </w:r>
+      <w:r>
+        <w:t xml:space="preserve"> </w:t>
+      </w:r>
+      <w:r>
+        <w:rPr>
+          <w:rStyle w:val="VerbatimChar"/>
+        </w:rPr>
+        <w:t xml:space="preserve">GetNetDeviceLayer ()</w:t>
+      </w:r>
+      <w:r>
+        <w:t xml:space="preserve">. Unused with</w:t>
+      </w:r>
+      <w:r>
+        <w:t xml:space="preserve"> </w:t>
+      </w:r>
+      <w:r>
+        <w:rPr>
+          <w:rStyle w:val="VerbatimChar"/>
+        </w:rPr>
+        <w:t xml:space="preserve">network = wlan</w:t>
+      </w:r>
+      <w:r>
+        <w:t xml:space="preserve"> </w:t>
+      </w:r>
+      <w:r>
+        <w:t xml:space="preserve">(the Pi 4's default): the Pi 4 runs as before.</w:t>
+      </w:r>
+      <w:r>
+        <w:t xml:space="preserve"> </w:t>
+      </w:r>
+      <w:r>
+        <w:rPr>
+          <w:bCs/>
+          <w:b/>
+        </w:rPr>
+        <w:t xml:space="preserve">Not tested on</w:t>
+      </w:r>
+      <w:r>
+        <w:rPr>
+          <w:bCs/>
+          <w:b/>
+        </w:rPr>
+        <w:t xml:space="preserve"> </w:t>
+      </w:r>
+      <w:r>
+        <w:rPr>
+          <w:bCs/>
+          <w:b/>
+        </w:rPr>
+        <w:t xml:space="preserve">a board yet.</w:t>
+      </w:r>
+      <w:r>
+        <w:t xml:space="preserve"> </w:t>
+      </w:r>
+      <w:r>
+        <w:t xml:space="preserve">Fork commit</w:t>
+      </w:r>
+      <w:r>
+        <w:t xml:space="preserve"> </w:t>
+      </w:r>
+      <w:r>
+        <w:rPr>
+          <w:rStyle w:val="VerbatimChar"/>
+        </w:rPr>
+        <w:t xml:space="preserve">ec821a94</w:t>
+      </w:r>
+      <w:r>
+        <w:t xml:space="preserve">.</w:t>
+      </w:r>
+    </w:p>
+    <w:bookmarkEnd w:id="55"/>
+    <w:bookmarkStart w:id="57" w:name="contributions-to-upstream-circle"/>
+    <w:p>
+      <w:pPr>
+        <w:pStyle w:val="Heading2"/>
+      </w:pPr>
+      <w:r>
+        <w:t xml:space="preserve">Contributions to upstream Circle</w:t>
+      </w:r>
+    </w:p>
+    <w:p>
+      <w:pPr>
+        <w:pStyle w:val="FirstParagraph"/>
+      </w:pPr>
+      <w:r>
         <w:t xml:space="preserve">The fork's changes useful to every Circle user are prepared as clean pull-request branches on</w:t>
       </w:r>
       <w:r>
@@ -19262,7 +19536,7 @@
       <w:r>
         <w:t xml:space="preserve"> </w:t>
       </w:r>
-      <w:hyperlink r:id="rId55">
+      <w:hyperlink r:id="rId56">
         <w:r>
           <w:rPr>
             <w:rStyle w:val="VerbatimChar"/>
@@ -19274,8 +19548,8 @@
         <w:t xml:space="preserve">.</w:t>
       </w:r>
     </w:p>
-    <w:bookmarkEnd w:id="56"/>
-    <w:bookmarkStart w:id="57" w:name="upstream-merges"/>
+    <w:bookmarkEnd w:id="57"/>
+    <w:bookmarkStart w:id="58" w:name="upstream-merges"/>
     <w:p>
       <w:pPr>
         <w:pStyle w:val="Heading2"/>
@@ -19664,8 +19938,8 @@
         <w:t xml:space="preserve">yet: a keyboard unplugged and plugged again (its layout kept), the 8BitDo / Xbox 360 wireless devices.</w:t>
       </w:r>
     </w:p>
-    <w:bookmarkEnd w:id="57"/>
-    <w:bookmarkStart w:id="58" w:name="updating-the-fork-submodule"/>
+    <w:bookmarkEnd w:id="58"/>
+    <w:bookmarkStart w:id="59" w:name="updating-the-fork-submodule"/>
     <w:p>
       <w:pPr>
         <w:pStyle w:val="Heading2"/>
@@ -19844,7 +20118,7 @@
         <w:t xml:space="preserve">"Bump circle submodule"</w:t>
       </w:r>
     </w:p>
-    <w:bookmarkEnd w:id="58"/>
+    <w:bookmarkEnd w:id="59"/>
     <w:sectPr>
       <w:footerReference r:id="rId9" w:type="default"/>
       <w:footnotePr>

</xml_diff>

<commit_message>
Keyboards: the Raspberry Pi keyboards' layouts -- SE (the Pi 500's Nordic), NO, DK, PT, JP (Ro / Yen: fork patch 32); a Pi 400 / Pi 500 says its own (kernel_info's keyboard line, from the OTP's rpi-country-code) and Setup takes it; packages onyx 2026.10.156, systemkit 1.93.2 (Pi 4 and Pi 5)
Co-Authored-By: Claude Opus 5.5 <noreply@anthropic.com>
Claude-Session: https://claude.ai/code/session_01NVTBGsTejLZor1Spptroyo
</commit_message>
<xml_diff>
--- a/docs/exports/05-CIRCLE-CHANGES.docx
+++ b/docs/exports/05-CIRCLE-CHANGES.docx
@@ -19759,13 +19759,13 @@
       </w:r>
     </w:p>
     <w:bookmarkEnd w:id="56"/>
-    <w:bookmarkStart w:id="58" w:name="contributions-to-upstream-circle"/>
+    <w:bookmarkStart w:id="57" w:name="Xbc59334efe595b8bb7c39661a2eb28019729b4a"/>
     <w:p>
       <w:pPr>
         <w:pStyle w:val="Heading2"/>
       </w:pPr>
       <w:r>
-        <w:t xml:space="preserve">Contributions to upstream Circle</w:t>
+        <w:t xml:space="preserve">32. The Japanese keyboards' Ro and Yen keys</w:t>
       </w:r>
     </w:p>
     <w:p>
@@ -19773,6 +19773,188 @@
         <w:pStyle w:val="FirstParagraph"/>
       </w:pPr>
       <w:r>
+        <w:rPr>
+          <w:bCs/>
+          <w:b/>
+        </w:rPr>
+        <w:t xml:space="preserve">Why.</w:t>
+      </w:r>
+      <w:r>
+        <w:t xml:space="preserve"> </w:t>
+      </w:r>
+      <w:r>
+        <w:t xml:space="preserve">A Japanese (JIS) keyboard -- the Raspberry Pi 500's and keyboard's</w:t>
+      </w:r>
+      <w:r>
+        <w:t xml:space="preserve"> </w:t>
+      </w:r>
+      <w:r>
+        <w:rPr>
+          <w:rStyle w:val="VerbatimChar"/>
+        </w:rPr>
+        <w:t xml:space="preserve">JP</w:t>
+      </w:r>
+      <w:r>
+        <w:t xml:space="preserve"> </w:t>
+      </w:r>
+      <w:r>
+        <w:t xml:space="preserve">variant -- has two keys past the</w:t>
+      </w:r>
+      <w:r>
+        <w:t xml:space="preserve"> </w:t>
+      </w:r>
+      <w:r>
+        <w:t xml:space="preserve">layout table's 128 rows: Ro (</w:t>
+      </w:r>
+      <w:r>
+        <w:rPr>
+          <w:rStyle w:val="VerbatimChar"/>
+        </w:rPr>
+        <w:t xml:space="preserve">\ _</w:t>
+      </w:r>
+      <w:r>
+        <w:t xml:space="preserve">, USB usage 0x87, International1) and Yen (</w:t>
+      </w:r>
+      <w:r>
+        <w:rPr>
+          <w:rStyle w:val="VerbatimChar"/>
+        </w:rPr>
+        <w:t xml:space="preserve">¥ |</w:t>
+      </w:r>
+      <w:r>
+        <w:t xml:space="preserve">, 0x89, International3);</w:t>
+      </w:r>
+      <w:r>
+        <w:t xml:space="preserve"> </w:t>
+      </w:r>
+      <w:r>
+        <w:rPr>
+          <w:rStyle w:val="VerbatimChar"/>
+        </w:rPr>
+        <w:t xml:space="preserve">CKeyMap::Translate</w:t>
+      </w:r>
+      <w:r>
+        <w:t xml:space="preserve"> </w:t>
+      </w:r>
+      <w:r>
+        <w:t xml:space="preserve">dropped them.</w:t>
+      </w:r>
+    </w:p>
+    <w:p>
+      <w:pPr>
+        <w:pStyle w:val="BodyText"/>
+      </w:pPr>
+      <w:r>
+        <w:rPr>
+          <w:bCs/>
+          <w:b/>
+        </w:rPr>
+        <w:t xml:space="preserve">What.</w:t>
+      </w:r>
+      <w:r>
+        <w:t xml:space="preserve"> </w:t>
+      </w:r>
+      <w:r>
+        <w:rPr>
+          <w:rStyle w:val="VerbatimChar"/>
+        </w:rPr>
+        <w:t xml:space="preserve">lib/input/keymap.cpp</w:t>
+      </w:r>
+      <w:r>
+        <w:t xml:space="preserve">,</w:t>
+      </w:r>
+      <w:r>
+        <w:t xml:space="preserve"> </w:t>
+      </w:r>
+      <w:r>
+        <w:rPr>
+          <w:rStyle w:val="VerbatimChar"/>
+        </w:rPr>
+        <w:t xml:space="preserve">CKeyMap::Translate</w:t>
+      </w:r>
+      <w:r>
+        <w:t xml:space="preserve">: 0x87 is taken at row 0x7D and 0x89 at 0x7E (Paste and</w:t>
+      </w:r>
+      <w:r>
+        <w:t xml:space="preserve"> </w:t>
+      </w:r>
+      <w:r>
+        <w:t xml:space="preserve">Find, which no layout maps), where</w:t>
+      </w:r>
+      <w:r>
+        <w:t xml:space="preserve"> </w:t>
+      </w:r>
+      <w:r>
+        <w:rPr>
+          <w:rStyle w:val="VerbatimChar"/>
+        </w:rPr>
+        <w:t xml:space="preserve">SD:/etc/keymaps/JP.kmap</w:t>
+      </w:r>
+      <w:r>
+        <w:t xml:space="preserve"> </w:t>
+      </w:r>
+      <w:r>
+        <w:t xml:space="preserve">has them. The raw keys (</w:t>
+      </w:r>
+      <w:r>
+        <w:rPr>
+          <w:rStyle w:val="VerbatimChar"/>
+        </w:rPr>
+        <w:t xml:space="preserve">kapi_key_held</w:t>
+      </w:r>
+      <w:r>
+        <w:t xml:space="preserve">, the games)</w:t>
+      </w:r>
+      <w:r>
+        <w:t xml:space="preserve"> </w:t>
+      </w:r>
+      <w:r>
+        <w:t xml:space="preserve">are unchanged. Not the keymap decoupling of §1 (its skill re-applies that one after an upstream merge: check this</w:t>
+      </w:r>
+      <w:r>
+        <w:t xml:space="preserve"> </w:t>
+      </w:r>
+      <w:r>
+        <w:t xml:space="preserve">fold is still there too). Fork commit</w:t>
+      </w:r>
+      <w:r>
+        <w:t xml:space="preserve"> </w:t>
+      </w:r>
+      <w:r>
+        <w:rPr>
+          <w:rStyle w:val="VerbatimChar"/>
+        </w:rPr>
+        <w:t xml:space="preserve">9a9180ba</w:t>
+      </w:r>
+      <w:r>
+        <w:t xml:space="preserve">.</w:t>
+      </w:r>
+      <w:r>
+        <w:t xml:space="preserve"> </w:t>
+      </w:r>
+      <w:r>
+        <w:rPr>
+          <w:bCs/>
+          <w:b/>
+        </w:rPr>
+        <w:t xml:space="preserve">Not tested on a Japanese keyboard yet.</w:t>
+      </w:r>
+    </w:p>
+    <w:bookmarkEnd w:id="57"/>
+    <w:bookmarkStart w:id="59" w:name="contributions-to-upstream-circle"/>
+    <w:p>
+      <w:pPr>
+        <w:pStyle w:val="Heading2"/>
+      </w:pPr>
+      <w:r>
+        <w:t xml:space="preserve">Contributions to upstream Circle</w:t>
+      </w:r>
+    </w:p>
+    <w:p>
+      <w:pPr>
+        <w:pStyle w:val="FirstParagraph"/>
+      </w:pPr>
+      <w:r>
         <w:t xml:space="preserve">The fork's changes useful to every Circle user are prepared as clean pull-request branches on</w:t>
       </w:r>
       <w:r>
@@ -19826,7 +20008,7 @@
       <w:r>
         <w:t xml:space="preserve"> </w:t>
       </w:r>
-      <w:hyperlink r:id="rId57">
+      <w:hyperlink r:id="rId58">
         <w:r>
           <w:rPr>
             <w:rStyle w:val="VerbatimChar"/>
@@ -19838,8 +20020,8 @@
         <w:t xml:space="preserve">.</w:t>
       </w:r>
     </w:p>
-    <w:bookmarkEnd w:id="58"/>
-    <w:bookmarkStart w:id="59" w:name="upstream-merges"/>
+    <w:bookmarkEnd w:id="59"/>
+    <w:bookmarkStart w:id="60" w:name="upstream-merges"/>
     <w:p>
       <w:pPr>
         <w:pStyle w:val="Heading2"/>
@@ -20228,8 +20410,8 @@
         <w:t xml:space="preserve">yet: a keyboard unplugged and plugged again (its layout kept), the 8BitDo / Xbox 360 wireless devices.</w:t>
       </w:r>
     </w:p>
-    <w:bookmarkEnd w:id="59"/>
-    <w:bookmarkStart w:id="60" w:name="updating-the-fork-submodule"/>
+    <w:bookmarkEnd w:id="60"/>
+    <w:bookmarkStart w:id="61" w:name="updating-the-fork-submodule"/>
     <w:p>
       <w:pPr>
         <w:pStyle w:val="Heading2"/>
@@ -20408,7 +20590,7 @@
         <w:t xml:space="preserve">"Bump circle submodule"</w:t>
       </w:r>
     </w:p>
-    <w:bookmarkEnd w:id="60"/>
+    <w:bookmarkEnd w:id="61"/>
     <w:sectPr>
       <w:footerReference r:id="rId9" w:type="default"/>
       <w:footnotePr>

</xml_diff>

<commit_message>
Pi 5: the alpha fix switchable -- cmdline opaque=0 (a recent Pi 500 bootloader honours framebuffer_ignore_alpha), the Display applet's check box; SystemKit display_save_option / display_saved_option; packages onyx 2026.10.162, systemkit 1.94.1 (Pi 4 and Pi 5)
Co-Authored-By: Claude Opus 5.5 <noreply@anthropic.com>
Claude-Session: https://claude.ai/code/session_01NVTBGsTejLZor1Spptroyo
</commit_message>
<xml_diff>
--- a/docs/exports/05-CIRCLE-CHANGES.docx
+++ b/docs/exports/05-CIRCLE-CHANGES.docx
@@ -19755,7 +19755,116 @@
           <w:bCs/>
           <w:b/>
         </w:rPr>
-        <w:t xml:space="preserve">Not tested on a board yet.</w:t>
+        <w:t xml:space="preserve">Switchable</w:t>
+      </w:r>
+      <w:r>
+        <w:t xml:space="preserve"> </w:t>
+      </w:r>
+      <w:r>
+        <w:t xml:space="preserve">(2026-10-10):</w:t>
+      </w:r>
+      <w:r>
+        <w:t xml:space="preserve"> </w:t>
+      </w:r>
+      <w:r>
+        <w:rPr>
+          <w:rStyle w:val="VerbatimChar"/>
+        </w:rPr>
+        <w:t xml:space="preserve">C2DGraphics::s_bOnyxOpaque</w:t>
+      </w:r>
+      <w:r>
+        <w:t xml:space="preserve"> </w:t>
+      </w:r>
+      <w:r>
+        <w:t xml:space="preserve">(default TRUE), set from the kernel's</w:t>
+      </w:r>
+      <w:r>
+        <w:t xml:space="preserve"> </w:t>
+      </w:r>
+      <w:r>
+        <w:rPr>
+          <w:rStyle w:val="VerbatimChar"/>
+        </w:rPr>
+        <w:t xml:space="preserve">cmdline.txt</w:t>
+      </w:r>
+      <w:r>
+        <w:t xml:space="preserve"> </w:t>
+      </w:r>
+      <w:r>
+        <w:rPr>
+          <w:rStyle w:val="VerbatimChar"/>
+        </w:rPr>
+        <w:t xml:space="preserve">opaque=</w:t>
+      </w:r>
+      <w:r>
+        <w:t xml:space="preserve"> </w:t>
+      </w:r>
+      <w:r>
+        <w:t xml:space="preserve">-- the tester found that the Pi 500's latest bootloader</w:t>
+      </w:r>
+      <w:r>
+        <w:t xml:space="preserve"> </w:t>
+      </w:r>
+      <w:r>
+        <w:t xml:space="preserve">honours</w:t>
+      </w:r>
+      <w:r>
+        <w:t xml:space="preserve"> </w:t>
+      </w:r>
+      <w:r>
+        <w:rPr>
+          <w:rStyle w:val="VerbatimChar"/>
+        </w:rPr>
+        <w:t xml:space="preserve">framebuffer_ignore_alpha=1</w:t>
+      </w:r>
+      <w:r>
+        <w:t xml:space="preserve"> </w:t>
+      </w:r>
+      <w:r>
+        <w:t xml:space="preserve">(Raspberry Pi OS also works around it in software);</w:t>
+      </w:r>
+      <w:r>
+        <w:t xml:space="preserve"> </w:t>
+      </w:r>
+      <w:r>
+        <w:rPr>
+          <w:rStyle w:val="VerbatimChar"/>
+        </w:rPr>
+        <w:t xml:space="preserve">opaque=0</w:t>
+      </w:r>
+      <w:r>
+        <w:t xml:space="preserve"> </w:t>
+      </w:r>
+      <w:r>
+        <w:t xml:space="preserve">skips the pass and</w:t>
+      </w:r>
+      <w:r>
+        <w:t xml:space="preserve"> </w:t>
+      </w:r>
+      <w:r>
+        <w:t xml:space="preserve">gives the direct mode back. The Display applet has the check box. Fork commit</w:t>
+      </w:r>
+      <w:r>
+        <w:t xml:space="preserve"> </w:t>
+      </w:r>
+      <w:r>
+        <w:rPr>
+          <w:rStyle w:val="VerbatimChar"/>
+        </w:rPr>
+        <w:t xml:space="preserve">b47451c6</w:t>
+      </w:r>
+      <w:r>
+        <w:t xml:space="preserve">.</w:t>
+      </w:r>
+      <w:r>
+        <w:t xml:space="preserve"> </w:t>
+      </w:r>
+      <w:r>
+        <w:rPr>
+          <w:bCs/>
+          <w:b/>
+        </w:rPr>
+        <w:t xml:space="preserve">Tested on a Pi 500 (2026-10-10): the desktop shows.</w:t>
       </w:r>
     </w:p>
     <w:bookmarkEnd w:id="56"/>

</xml_diff>

<commit_message>
kmsg: each line timed since boot (kapi v100 klog_read_at; Circle's logger notes the system timer, keeps 1024 events) -- the boot measured: the kernel gives the display 3.5 s after its first line
Circle patch 37 (fork 99c384b2). Measured on the Pi 4 in pocket mode: firmware 0-4.5 s, the graphics server
has the display at 8.0 s, the shell at 8.5 s, the network at 23.2 s. docs/02, 04, 05, 10, the exports; the
Programmez! key points and Word draft updated.

Co-Authored-By: Claude Opus 5.5 <noreply@anthropic.com>
</commit_message>
<xml_diff>
--- a/docs/exports/05-CIRCLE-CHANGES.docx
+++ b/docs/exports/05-CIRCLE-CHANGES.docx
@@ -3097,6 +3097,169 @@
                 <w:rStyle w:val="VerbatimChar"/>
               </w:rPr>
               <w:t xml:space="preserve">libcircle</w:t>
+            </w:r>
+          </w:p>
+        </w:tc>
+      </w:tr>
+      <w:tr>
+        <w:tc>
+          <w:tcPr/>
+          <w:p>
+            <w:pPr>
+              <w:pStyle w:val="Compact"/>
+            </w:pPr>
+            <w:r>
+              <w:t xml:space="preserve">37</w:t>
+            </w:r>
+          </w:p>
+        </w:tc>
+        <w:tc>
+          <w:tcPr/>
+          <w:p>
+            <w:pPr>
+              <w:pStyle w:val="Compact"/>
+            </w:pPr>
+            <w:r>
+              <w:rPr>
+                <w:b/>
+                <w:bCs/>
+              </w:rPr>
+              <w:t xml:space="preserve">The log's events timed since boot</w:t>
+            </w:r>
+            <w:r>
+              <w:t xml:space="preserve"> </w:t>
+            </w:r>
+            <w:r>
+              <w:t xml:space="preserve">(</w:t>
+            </w:r>
+            <w:r>
+              <w:rPr>
+                <w:rStyle w:val="VerbatimChar"/>
+              </w:rPr>
+              <w:t xml:space="preserve">ReadEvent</w:t>
+            </w:r>
+            <w:r>
+              <w:t xml:space="preserve">'s overload with</w:t>
+            </w:r>
+            <w:r>
+              <w:t xml:space="preserve"> </w:t>
+            </w:r>
+            <w:r>
+              <w:rPr>
+                <w:rStyle w:val="VerbatimChar"/>
+              </w:rPr>
+              <w:t xml:space="preserve">u64 *pUptimeMicros</w:t>
+            </w:r>
+            <w:r>
+              <w:t xml:space="preserve">, the system timer) and</w:t>
+            </w:r>
+            <w:r>
+              <w:t xml:space="preserve"> </w:t>
+            </w:r>
+            <w:r>
+              <w:rPr>
+                <w:b/>
+                <w:bCs/>
+              </w:rPr>
+              <w:t xml:space="preserve">1024 events kept</w:t>
+            </w:r>
+            <w:r>
+              <w:t xml:space="preserve"> </w:t>
+            </w:r>
+            <w:r>
+              <w:t xml:space="preserve">(</w:t>
+            </w:r>
+            <w:r>
+              <w:rPr>
+                <w:rStyle w:val="VerbatimChar"/>
+              </w:rPr>
+              <w:t xml:space="preserve">LOG_QUEUE_SIZE</w:t>
+            </w:r>
+            <w:r>
+              <w:t xml:space="preserve">, 50 upstream):</w:t>
+            </w:r>
+            <w:r>
+              <w:t xml:space="preserve"> </w:t>
+            </w:r>
+            <w:r>
+              <w:rPr>
+                <w:rStyle w:val="VerbatimChar"/>
+              </w:rPr>
+              <w:t xml:space="preserve">kmsg</w:t>
+            </w:r>
+            <w:r>
+              <w:t xml:space="preserve"> </w:t>
+            </w:r>
+            <w:r>
+              <w:t xml:space="preserve">shows a whole boot, timed (kapi v100</w:t>
+            </w:r>
+            <w:r>
+              <w:t xml:space="preserve"> </w:t>
+            </w:r>
+            <w:r>
+              <w:rPr>
+                <w:rStyle w:val="VerbatimChar"/>
+              </w:rPr>
+              <w:t xml:space="preserve">klog_read_at</w:t>
+            </w:r>
+            <w:r>
+              <w:t xml:space="preserve">)</w:t>
+            </w:r>
+          </w:p>
+        </w:tc>
+        <w:tc>
+          <w:tcPr/>
+          <w:p>
+            <w:pPr>
+              <w:pStyle w:val="Compact"/>
+            </w:pPr>
+            <w:r>
+              <w:rPr>
+                <w:rStyle w:val="VerbatimChar"/>
+              </w:rPr>
+              <w:t xml:space="preserve">include/circle/logger.h</w:t>
+            </w:r>
+            <w:r>
+              <w:t xml:space="preserve">,</w:t>
+            </w:r>
+            <w:r>
+              <w:t xml:space="preserve"> </w:t>
+            </w:r>
+            <w:r>
+              <w:rPr>
+                <w:rStyle w:val="VerbatimChar"/>
+              </w:rPr>
+              <w:t xml:space="preserve">lib/logger.cpp</w:t>
+            </w:r>
+          </w:p>
+        </w:tc>
+        <w:tc>
+          <w:tcPr/>
+          <w:p>
+            <w:pPr>
+              <w:pStyle w:val="Compact"/>
+            </w:pPr>
+            <w:r>
+              <w:rPr>
+                <w:b/>
+                <w:bCs/>
+              </w:rPr>
+              <w:t xml:space="preserve">every library</w:t>
+            </w:r>
+            <w:r>
+              <w:t xml:space="preserve"> </w:t>
+            </w:r>
+            <w:r>
+              <w:t xml:space="preserve">(</w:t>
+            </w:r>
+            <w:r>
+              <w:rPr>
+                <w:rStyle w:val="VerbatimChar"/>
+              </w:rPr>
+              <w:t xml:space="preserve">CLogger</w:t>
+            </w:r>
+            <w:r>
+              <w:t xml:space="preserve">'s size) + the kernel</w:t>
             </w:r>
           </w:p>
         </w:tc>
@@ -19875,13 +20038,13 @@
       </w:r>
     </w:p>
     <w:bookmarkEnd w:id="55"/>
-    <w:bookmarkStart w:id="57" w:name="contributions-to-upstream-circle"/>
+    <w:bookmarkStart w:id="56" w:name="X8679c54d2d7c0a14e51012381722c4212651b20"/>
     <w:p>
       <w:pPr>
         <w:pStyle w:val="Heading2"/>
       </w:pPr>
       <w:r>
-        <w:t xml:space="preserve">Contributions to upstream Circle</w:t>
+        <w:t xml:space="preserve">33. The Pi 4's DWC OTG controller as a host beside the xHCI (the USB-C socket)</w:t>
       </w:r>
     </w:p>
     <w:p>
@@ -19889,6 +20052,1886 @@
         <w:pStyle w:val="FirstParagraph"/>
       </w:pPr>
       <w:r>
+        <w:rPr>
+          <w:b/>
+          <w:bCs/>
+        </w:rPr>
+        <w:t xml:space="preserve">Why.</w:t>
+      </w:r>
+      <w:r>
+        <w:t xml:space="preserve"> </w:t>
+      </w:r>
+      <w:r>
+        <w:t xml:space="preserve">The keyboard of the</w:t>
+      </w:r>
+      <w:r>
+        <w:t xml:space="preserve"> </w:t>
+      </w:r>
+      <w:r>
+        <w:rPr>
+          <w:b/>
+          <w:bCs/>
+        </w:rPr>
+        <w:t xml:space="preserve">Waveshare PocketTerm35</w:t>
+      </w:r>
+      <w:r>
+        <w:t xml:space="preserve"> </w:t>
+      </w:r>
+      <w:r>
+        <w:t xml:space="preserve">(an RP2040, an ordinary USB HID keyboard that</w:t>
+      </w:r>
+      <w:r>
+        <w:t xml:space="preserve"> </w:t>
+      </w:r>
+      <w:r>
+        <w:rPr>
+          <w:rStyle w:val="VerbatimChar"/>
+        </w:rPr>
+        <w:t xml:space="preserve">CUSBKeyboard</w:t>
+      </w:r>
+      <w:r>
+        <w:t xml:space="preserve"> </w:t>
+      </w:r>
+      <w:r>
+        <w:t xml:space="preserve">takes) is wired to the Pi 4's</w:t>
+      </w:r>
+      <w:r>
+        <w:t xml:space="preserve"> </w:t>
+      </w:r>
+      <w:r>
+        <w:rPr>
+          <w:b/>
+          <w:bCs/>
+        </w:rPr>
+        <w:t xml:space="preserve">USB-C socket</w:t>
+      </w:r>
+      <w:r>
+        <w:t xml:space="preserve">. On a Pi 4 B that socket is the</w:t>
+      </w:r>
+      <w:r>
+        <w:t xml:space="preserve"> </w:t>
+      </w:r>
+      <w:r>
+        <w:rPr>
+          <w:b/>
+          <w:bCs/>
+        </w:rPr>
+        <w:t xml:space="preserve">DWC OTG</w:t>
+      </w:r>
+      <w:r>
+        <w:t xml:space="preserve"> </w:t>
+      </w:r>
+      <w:r>
+        <w:t xml:space="preserve">controller's (Linux:</w:t>
+      </w:r>
+      <w:r>
+        <w:t xml:space="preserve"> </w:t>
+      </w:r>
+      <w:r>
+        <w:rPr>
+          <w:rStyle w:val="VerbatimChar"/>
+        </w:rPr>
+        <w:t xml:space="preserve">dtoverlay=dwc2,dr_mode=host</w:t>
+      </w:r>
+      <w:r>
+        <w:t xml:space="preserve">, the maker's instructions). Upstream builds the DWC host driver (</w:t>
+      </w:r>
+      <w:r>
+        <w:rPr>
+          <w:rStyle w:val="VerbatimChar"/>
+        </w:rPr>
+        <w:t xml:space="preserve">CDWHCIDevice</w:t>
+      </w:r>
+      <w:r>
+        <w:t xml:space="preserve">) for the</w:t>
+      </w:r>
+      <w:r>
+        <w:t xml:space="preserve"> </w:t>
+      </w:r>
+      <w:r>
+        <w:t xml:space="preserve">Pi 1-3 only, and the USB library chooses xHCI or DWHCI when it is built (</w:t>
+      </w:r>
+      <w:r>
+        <w:rPr>
+          <w:rStyle w:val="VerbatimChar"/>
+        </w:rPr>
+        <w:t xml:space="preserve">RASPPI &lt;= 3</w:t>
+      </w:r>
+      <w:r>
+        <w:t xml:space="preserve"> </w:t>
+      </w:r>
+      <w:r>
+        <w:t xml:space="preserve">/</w:t>
+      </w:r>
+      <w:r>
+        <w:t xml:space="preserve"> </w:t>
+      </w:r>
+      <w:r>
+        <w:rPr>
+          <w:rStyle w:val="VerbatimChar"/>
+        </w:rPr>
+        <w:t xml:space="preserve">&gt;= 4</w:t>
+      </w:r>
+      <w:r>
+        <w:t xml:space="preserve">).</w:t>
+      </w:r>
+    </w:p>
+    <w:p>
+      <w:pPr>
+        <w:pStyle w:val="BodyText"/>
+      </w:pPr>
+      <w:r>
+        <w:rPr>
+          <w:b/>
+          <w:bCs/>
+        </w:rPr>
+        <w:t xml:space="preserve">What.</w:t>
+      </w:r>
+    </w:p>
+    <w:p>
+      <w:pPr>
+        <w:pStyle w:val="Compact"/>
+        <w:numPr>
+          <w:ilvl w:val="0"/>
+          <w:numId w:val="1012"/>
+        </w:numPr>
+      </w:pPr>
+      <w:r>
+        <w:rPr>
+          <w:rStyle w:val="VerbatimChar"/>
+        </w:rPr>
+        <w:t xml:space="preserve">sysconfig.h</w:t>
+      </w:r>
+      <w:r>
+        <w:t xml:space="preserve">:</w:t>
+      </w:r>
+      <w:r>
+        <w:t xml:space="preserve"> </w:t>
+      </w:r>
+      <w:r>
+        <w:rPr>
+          <w:rStyle w:val="VerbatimChar"/>
+        </w:rPr>
+        <w:t xml:space="preserve">USB_HCI_DWHCI</w:t>
+      </w:r>
+      <w:r>
+        <w:t xml:space="preserve"> </w:t>
+      </w:r>
+      <w:r>
+        <w:t xml:space="preserve">/</w:t>
+      </w:r>
+      <w:r>
+        <w:t xml:space="preserve"> </w:t>
+      </w:r>
+      <w:r>
+        <w:rPr>
+          <w:rStyle w:val="VerbatimChar"/>
+        </w:rPr>
+        <w:t xml:space="preserve">USB_HCI_XHCI</w:t>
+      </w:r>
+      <w:r>
+        <w:t xml:space="preserve">, what the library is built for --</w:t>
+      </w:r>
+      <w:r>
+        <w:t xml:space="preserve"> </w:t>
+      </w:r>
+      <w:r>
+        <w:rPr>
+          <w:b/>
+          <w:bCs/>
+        </w:rPr>
+        <w:t xml:space="preserve">both on the Pi 4</w:t>
+      </w:r>
+      <w:r>
+        <w:t xml:space="preserve"> </w:t>
+      </w:r>
+      <w:r>
+        <w:t xml:space="preserve">(without</w:t>
+      </w:r>
+      <w:r>
+        <w:t xml:space="preserve"> </w:t>
+      </w:r>
+      <w:r>
+        <w:rPr>
+          <w:rStyle w:val="VerbatimChar"/>
+        </w:rPr>
+        <w:t xml:space="preserve">USE_XHCI_INTERNAL</w:t>
+      </w:r>
+      <w:r>
+        <w:t xml:space="preserve">).</w:t>
+      </w:r>
+      <w:r>
+        <w:t xml:space="preserve"> </w:t>
+      </w:r>
+      <w:r>
+        <w:rPr>
+          <w:rStyle w:val="VerbatimChar"/>
+        </w:rPr>
+        <w:t xml:space="preserve">CUSBHostController::IsXHCI ()</w:t>
+      </w:r>
+      <w:r>
+        <w:t xml:space="preserve"> </w:t>
+      </w:r>
+      <w:r>
+        <w:t xml:space="preserve">(TRUE in</w:t>
+      </w:r>
+      <w:r>
+        <w:t xml:space="preserve"> </w:t>
+      </w:r>
+      <w:r>
+        <w:rPr>
+          <w:rStyle w:val="VerbatimChar"/>
+        </w:rPr>
+        <w:t xml:space="preserve">CXHCIDevice</w:t>
+      </w:r>
+      <w:r>
+        <w:t xml:space="preserve">) and</w:t>
+      </w:r>
+      <w:r>
+        <w:t xml:space="preserve"> </w:t>
+      </w:r>
+      <w:r>
+        <w:rPr>
+          <w:rStyle w:val="VerbatimChar"/>
+        </w:rPr>
+        <w:t xml:space="preserve">USB_HOST_IS_XHCI (host)</w:t>
+      </w:r>
+      <w:r>
+        <w:t xml:space="preserve">: the</w:t>
+      </w:r>
+      <w:r>
+        <w:t xml:space="preserve"> </w:t>
+      </w:r>
+      <w:r>
+        <w:t xml:space="preserve">library asks a device's host which one it is where it chose by the board --</w:t>
+      </w:r>
+      <w:r>
+        <w:t xml:space="preserve"> </w:t>
+      </w:r>
+      <w:r>
+        <w:rPr>
+          <w:rStyle w:val="VerbatimChar"/>
+        </w:rPr>
+        <w:t xml:space="preserve">usbdevice</w:t>
+      </w:r>
+      <w:r>
+        <w:t xml:space="preserve"> </w:t>
+      </w:r>
+      <w:r>
+        <w:t xml:space="preserve">(the address from the pool</w:t>
+      </w:r>
+      <w:r>
+        <w:t xml:space="preserve"> </w:t>
+      </w:r>
+      <w:r>
+        <w:t xml:space="preserve">on a DWHCI device, the slot on an xHCI one;</w:t>
+      </w:r>
+      <w:r>
+        <w:t xml:space="preserve"> </w:t>
+      </w:r>
+      <w:r>
+        <w:rPr>
+          <w:rStyle w:val="VerbatimChar"/>
+        </w:rPr>
+        <w:t xml:space="preserve">EnableHubFunction ()</w:t>
+      </w:r>
+      <w:r>
+        <w:t xml:space="preserve"> </w:t>
+      </w:r>
+      <w:r>
+        <w:t xml:space="preserve">no longer pure),</w:t>
+      </w:r>
+      <w:r>
+        <w:t xml:space="preserve"> </w:t>
+      </w:r>
+      <w:r>
+        <w:rPr>
+          <w:rStyle w:val="VerbatimChar"/>
+        </w:rPr>
+        <w:t xml:space="preserve">usbendpoint</w:t>
+      </w:r>
+      <w:r>
+        <w:t xml:space="preserve"> </w:t>
+      </w:r>
+      <w:r>
+        <w:t xml:space="preserve">(the PID and</w:t>
+      </w:r>
+      <w:r>
+        <w:t xml:space="preserve"> </w:t>
+      </w:r>
+      <w:r>
+        <w:t xml:space="preserve">interval of a DWHCI endpoint, the</w:t>
+      </w:r>
+      <w:r>
+        <w:t xml:space="preserve"> </w:t>
+      </w:r>
+      <w:r>
+        <w:rPr>
+          <w:rStyle w:val="VerbatimChar"/>
+        </w:rPr>
+        <w:t xml:space="preserve">CXHCIEndpoint</w:t>
+      </w:r>
+      <w:r>
+        <w:t xml:space="preserve"> </w:t>
+      </w:r>
+      <w:r>
+        <w:t xml:space="preserve">of an xHCI one),</w:t>
+      </w:r>
+      <w:r>
+        <w:t xml:space="preserve"> </w:t>
+      </w:r>
+      <w:r>
+        <w:rPr>
+          <w:rStyle w:val="VerbatimChar"/>
+        </w:rPr>
+        <w:t xml:space="preserve">usbstandardhub</w:t>
+      </w:r>
+      <w:r>
+        <w:t xml:space="preserve"> </w:t>
+      </w:r>
+      <w:r>
+        <w:t xml:space="preserve">(the child's class),</w:t>
+      </w:r>
+      <w:r>
+        <w:t xml:space="preserve"> </w:t>
+      </w:r>
+      <w:r>
+        <w:rPr>
+          <w:rStyle w:val="VerbatimChar"/>
+        </w:rPr>
+        <w:t xml:space="preserve">usbstring</w:t>
+      </w:r>
+      <w:r>
+        <w:t xml:space="preserve"> </w:t>
+      </w:r>
+      <w:r>
+        <w:t xml:space="preserve">(the long request on xHCI),</w:t>
+      </w:r>
+      <w:r>
+        <w:t xml:space="preserve"> </w:t>
+      </w:r>
+      <w:r>
+        <w:rPr>
+          <w:rStyle w:val="VerbatimChar"/>
+        </w:rPr>
+        <w:t xml:space="preserve">usbserialhost</w:t>
+      </w:r>
+      <w:r>
+        <w:t xml:space="preserve">,</w:t>
+      </w:r>
+      <w:r>
+        <w:t xml:space="preserve"> </w:t>
+      </w:r>
+      <w:r>
+        <w:rPr>
+          <w:rStyle w:val="VerbatimChar"/>
+        </w:rPr>
+        <w:t xml:space="preserve">usbaudiostreaming</w:t>
+      </w:r>
+      <w:r>
+        <w:t xml:space="preserve">,</w:t>
+      </w:r>
+      <w:r>
+        <w:t xml:space="preserve"> </w:t>
+      </w:r>
+      <w:r>
+        <w:rPr>
+          <w:rStyle w:val="VerbatimChar"/>
+        </w:rPr>
+        <w:t xml:space="preserve">usbfloppydevice</w:t>
+      </w:r>
+      <w:r>
+        <w:t xml:space="preserve">;</w:t>
+      </w:r>
+      <w:r>
+        <w:t xml:space="preserve"> </w:t>
+      </w:r>
+      <w:r>
+        <w:rPr>
+          <w:rStyle w:val="VerbatimChar"/>
+        </w:rPr>
+        <w:t xml:space="preserve">CDWHCIRootPort::GetPortID ()</w:t>
+      </w:r>
+      <w:r>
+        <w:t xml:space="preserve"> </w:t>
+      </w:r>
+      <w:r>
+        <w:t xml:space="preserve">= 1. The Pi 1-3 and the Pi 5 build as before.</w:t>
+      </w:r>
+    </w:p>
+    <w:p>
+      <w:pPr>
+        <w:pStyle w:val="Compact"/>
+        <w:numPr>
+          <w:ilvl w:val="0"/>
+          <w:numId w:val="1012"/>
+        </w:numPr>
+      </w:pPr>
+      <w:r>
+        <w:rPr>
+          <w:rStyle w:val="VerbatimChar"/>
+        </w:rPr>
+        <w:t xml:space="preserve">CUSBHCIDevice</w:t>
+      </w:r>
+      <w:r>
+        <w:t xml:space="preserve"> </w:t>
+      </w:r>
+      <w:r>
+        <w:t xml:space="preserve">is</w:t>
+      </w:r>
+      <w:r>
+        <w:t xml:space="preserve"> </w:t>
+      </w:r>
+      <w:r>
+        <w:rPr>
+          <w:rStyle w:val="VerbatimChar"/>
+          <w:b/>
+          <w:bCs/>
+        </w:rPr>
+        <w:t xml:space="preserve">CUSBSubSystem</w:t>
+      </w:r>
+      <w:r>
+        <w:t xml:space="preserve"> </w:t>
+      </w:r>
+      <w:r>
+        <w:t xml:space="preserve">on the Pi 4 (</w:t>
+      </w:r>
+      <w:r>
+        <w:rPr>
+          <w:rStyle w:val="VerbatimChar"/>
+        </w:rPr>
+        <w:t xml:space="preserve">usbhcidevice.h</w:t>
+      </w:r>
+      <w:r>
+        <w:t xml:space="preserve">,</w:t>
+      </w:r>
+      <w:r>
+        <w:t xml:space="preserve"> </w:t>
+      </w:r>
+      <w:r>
+        <w:rPr>
+          <w:rStyle w:val="VerbatimChar"/>
+        </w:rPr>
+        <w:t xml:space="preserve">lib/usb/Makefile</w:t>
+      </w:r>
+      <w:r>
+        <w:t xml:space="preserve">: the DWHCI and the</w:t>
+      </w:r>
+      <w:r>
+        <w:t xml:space="preserve"> </w:t>
+      </w:r>
+      <w:r>
+        <w:t xml:space="preserve">subsystem built for the Pi 4): the VL805's xHCI, and the</w:t>
+      </w:r>
+      <w:r>
+        <w:t xml:space="preserve"> </w:t>
+      </w:r>
+      <w:r>
+        <w:rPr>
+          <w:rStyle w:val="VerbatimChar"/>
+        </w:rPr>
+        <w:t xml:space="preserve">CDWHCIDevice</w:t>
+      </w:r>
+      <w:r>
+        <w:t xml:space="preserve"> </w:t>
+      </w:r>
+      <w:r>
+        <w:t xml:space="preserve">made in</w:t>
+      </w:r>
+      <w:r>
+        <w:t xml:space="preserve"> </w:t>
+      </w:r>
+      <w:r>
+        <w:rPr>
+          <w:rStyle w:val="VerbatimChar"/>
+        </w:rPr>
+        <w:t xml:space="preserve">Initialize ()</w:t>
+      </w:r>
+      <w:r>
+        <w:t xml:space="preserve"> </w:t>
+      </w:r>
+      <w:r>
+        <w:t xml:space="preserve">after</w:t>
+      </w:r>
+      <w:r>
+        <w:t xml:space="preserve"> </w:t>
+      </w:r>
+      <w:r>
+        <w:rPr>
+          <w:rStyle w:val="VerbatimChar"/>
+        </w:rPr>
+        <w:t xml:space="preserve">EnableDWHCI ()</w:t>
+      </w:r>
+      <w:r>
+        <w:t xml:space="preserve">; its failure is a warning, the USB-A sockets keep working.</w:t>
+      </w:r>
+    </w:p>
+    <w:p>
+      <w:pPr>
+        <w:pStyle w:val="Compact"/>
+        <w:numPr>
+          <w:ilvl w:val="0"/>
+          <w:numId w:val="1012"/>
+        </w:numPr>
+      </w:pPr>
+      <w:r>
+        <w:rPr>
+          <w:rStyle w:val="VerbatimChar"/>
+        </w:rPr>
+        <w:t xml:space="preserve">dwhcidevice.cpp</w:t>
+      </w:r>
+      <w:r>
+        <w:t xml:space="preserve">,</w:t>
+      </w:r>
+      <w:r>
+        <w:t xml:space="preserve"> </w:t>
+      </w:r>
+      <w:r>
+        <w:rPr>
+          <w:rStyle w:val="VerbatimChar"/>
+        </w:rPr>
+        <w:t xml:space="preserve">InitCore ()</w:t>
+      </w:r>
+      <w:r>
+        <w:t xml:space="preserve">, Pi 4: the host mode</w:t>
+      </w:r>
+      <w:r>
+        <w:t xml:space="preserve"> </w:t>
+      </w:r>
+      <w:r>
+        <w:rPr>
+          <w:b/>
+          <w:bCs/>
+        </w:rPr>
+        <w:t xml:space="preserve">forced</w:t>
+      </w:r>
+      <w:r>
+        <w:t xml:space="preserve"> </w:t>
+      </w:r>
+      <w:r>
+        <w:t xml:space="preserve">(</w:t>
+      </w:r>
+      <w:r>
+        <w:rPr>
+          <w:rStyle w:val="VerbatimChar"/>
+        </w:rPr>
+        <w:t xml:space="preserve">DWHCI_CORE_USB_CFG_FORCE_HOST_MODE</w:t>
+      </w:r>
+      <w:r>
+        <w:t xml:space="preserve">, bit 29),</w:t>
+      </w:r>
+      <w:r>
+        <w:t xml:space="preserve"> </w:t>
+      </w:r>
+      <w:r>
+        <w:t xml:space="preserve">then waited for (</w:t>
+      </w:r>
+      <w:r>
+        <w:rPr>
+          <w:rStyle w:val="VerbatimChar"/>
+        </w:rPr>
+        <w:t xml:space="preserve">CUR_MODE_HOST</w:t>
+      </w:r>
+      <w:r>
+        <w:t xml:space="preserve">, 200 ms at most) -- the USB-C socket has no ID pin saying "host". Its DMA uses</w:t>
+      </w:r>
+      <w:r>
+        <w:t xml:space="preserve"> </w:t>
+      </w:r>
+      <w:r>
+        <w:rPr>
+          <w:rStyle w:val="VerbatimChar"/>
+        </w:rPr>
+        <w:t xml:space="preserve">BUS_ADDRESS</w:t>
+      </w:r>
+      <w:r>
+        <w:t xml:space="preserve"> </w:t>
+      </w:r>
+      <w:r>
+        <w:t xml:space="preserve">(the first GB,</w:t>
+      </w:r>
+      <w:r>
+        <w:t xml:space="preserve"> </w:t>
+      </w:r>
+      <w:r>
+        <w:rPr>
+          <w:rStyle w:val="VerbatimChar"/>
+        </w:rPr>
+        <w:t xml:space="preserve">HEAP_LOW</w:t>
+      </w:r>
+      <w:r>
+        <w:t xml:space="preserve"> </w:t>
+      </w:r>
+      <w:r>
+        <w:t xml:space="preserve">buffers), as the gadget driver does on the Pi 4.</w:t>
+      </w:r>
+    </w:p>
+    <w:p>
+      <w:pPr>
+        <w:pStyle w:val="FirstParagraph"/>
+      </w:pPr>
+      <w:r>
+        <w:t xml:space="preserve">The kernel calls</w:t>
+      </w:r>
+      <w:r>
+        <w:t xml:space="preserve"> </w:t>
+      </w:r>
+      <w:r>
+        <w:rPr>
+          <w:rStyle w:val="VerbatimChar"/>
+        </w:rPr>
+        <w:t xml:space="preserve">EnableDWHCI ()</w:t>
+      </w:r>
+      <w:r>
+        <w:t xml:space="preserve"> </w:t>
+      </w:r>
+      <w:r>
+        <w:t xml:space="preserve">for</w:t>
+      </w:r>
+      <w:r>
+        <w:t xml:space="preserve"> </w:t>
+      </w:r>
+      <w:r>
+        <w:rPr>
+          <w:rStyle w:val="VerbatimChar"/>
+        </w:rPr>
+        <w:t xml:space="preserve">cmdline.txt usbc=1</w:t>
+      </w:r>
+      <w:r>
+        <w:t xml:space="preserve"> </w:t>
+      </w:r>
+      <w:r>
+        <w:t xml:space="preserve">(docs/02 §1, docs/04</w:t>
+      </w:r>
+      <w:r>
+        <w:t xml:space="preserve"> </w:t>
+      </w:r>
+      <w:r>
+        <w:rPr>
+          <w:rStyle w:val="VerbatimChar"/>
+        </w:rPr>
+        <w:t xml:space="preserve">cmdline.txt</w:t>
+      </w:r>
+      <w:r>
+        <w:t xml:space="preserve">). USB audio on the</w:t>
+      </w:r>
+      <w:r>
+        <w:t xml:space="preserve"> </w:t>
+      </w:r>
+      <w:r>
+        <w:t xml:space="preserve">DWHCI is not supported (</w:t>
+      </w:r>
+      <w:r>
+        <w:rPr>
+          <w:rStyle w:val="VerbatimChar"/>
+        </w:rPr>
+        <w:t xml:space="preserve">usbsoundbasedevice</w:t>
+      </w:r>
+      <w:r>
+        <w:t xml:space="preserve"> </w:t>
+      </w:r>
+      <w:r>
+        <w:t xml:space="preserve">is xHCI's). Fork commit</w:t>
+      </w:r>
+      <w:r>
+        <w:t xml:space="preserve"> </w:t>
+      </w:r>
+      <w:r>
+        <w:rPr>
+          <w:rStyle w:val="VerbatimChar"/>
+        </w:rPr>
+        <w:t xml:space="preserve">1ba908d7</w:t>
+      </w:r>
+      <w:r>
+        <w:t xml:space="preserve">.</w:t>
+      </w:r>
+      <w:r>
+        <w:t xml:space="preserve"> </w:t>
+      </w:r>
+      <w:r>
+        <w:rPr>
+          <w:b/>
+          <w:bCs/>
+        </w:rPr>
+        <w:t xml:space="preserve">Tried on the device</w:t>
+      </w:r>
+      <w:r>
+        <w:t xml:space="preserve"> </w:t>
+      </w:r>
+      <w:r>
+        <w:t xml:space="preserve">(2026-10-26): the keyboard types, with §34 and §35.</w:t>
+      </w:r>
+    </w:p>
+    <w:p>
+      <w:pPr>
+        <w:pStyle w:val="BodyText"/>
+      </w:pPr>
+      <w:r>
+        <w:rPr>
+          <w:i/>
+          <w:iCs/>
+        </w:rPr>
+        <w:t xml:space="preserve">History:</w:t>
+      </w:r>
+      <w:r>
+        <w:t xml:space="preserve"> </w:t>
+      </w:r>
+      <w:r>
+        <w:t xml:space="preserve">a first try the same morning drove the SoC's</w:t>
+      </w:r>
+      <w:r>
+        <w:t xml:space="preserve"> </w:t>
+      </w:r>
+      <w:r>
+        <w:rPr>
+          <w:b/>
+          <w:bCs/>
+        </w:rPr>
+        <w:t xml:space="preserve">internal xHCI</w:t>
+      </w:r>
+      <w:r>
+        <w:t xml:space="preserve"> </w:t>
+      </w:r>
+      <w:r>
+        <w:t xml:space="preserve">instead (</w:t>
+      </w:r>
+      <w:r>
+        <w:rPr>
+          <w:rStyle w:val="VerbatimChar"/>
+        </w:rPr>
+        <w:t xml:space="preserve">config.txt otg_mode=1</w:t>
+      </w:r>
+      <w:r>
+        <w:t xml:space="preserve">, fork</w:t>
+      </w:r>
+      <w:r>
+        <w:t xml:space="preserve"> </w:t>
+      </w:r>
+      <w:r>
+        <w:rPr>
+          <w:rStyle w:val="VerbatimChar"/>
+        </w:rPr>
+        <w:t xml:space="preserve">af3c5667</w:t>
+      </w:r>
+      <w:r>
+        <w:t xml:space="preserve">): the Pi 4 B hung at boot when its registers were read (that controller is the CM4's); reverted</w:t>
+      </w:r>
+      <w:r>
+        <w:t xml:space="preserve"> </w:t>
+      </w:r>
+      <w:r>
+        <w:t xml:space="preserve">(</w:t>
+      </w:r>
+      <w:r>
+        <w:rPr>
+          <w:rStyle w:val="VerbatimChar"/>
+        </w:rPr>
+        <w:t xml:space="preserve">85e3c7d7</w:t>
+      </w:r>
+      <w:r>
+        <w:t xml:space="preserve">).</w:t>
+      </w:r>
+    </w:p>
+    <w:bookmarkEnd w:id="56"/>
+    <w:bookmarkStart w:id="57" w:name="Xe25c1d886b45430da2435568e2fde697bb014f7"/>
+    <w:p>
+      <w:pPr>
+        <w:pStyle w:val="Heading2"/>
+      </w:pPr>
+      <w:r>
+        <w:t xml:space="preserve">34. A keyboard read from its HID report descriptor (a composite interface)</w:t>
+      </w:r>
+    </w:p>
+    <w:p>
+      <w:pPr>
+        <w:pStyle w:val="FirstParagraph"/>
+      </w:pPr>
+      <w:r>
+        <w:rPr>
+          <w:b/>
+          <w:bCs/>
+        </w:rPr>
+        <w:t xml:space="preserve">Why.</w:t>
+      </w:r>
+      <w:r>
+        <w:t xml:space="preserve"> </w:t>
+      </w:r>
+      <w:r>
+        <w:t xml:space="preserve">The PocketTerm35's RP2040 is not a boot keyboard: its one HID interface is</w:t>
+      </w:r>
+      <w:r>
+        <w:t xml:space="preserve"> </w:t>
+      </w:r>
+      <w:r>
+        <w:rPr>
+          <w:rStyle w:val="VerbatimChar"/>
+        </w:rPr>
+        <w:t xml:space="preserve">int3-0-0</w:t>
+      </w:r>
+      <w:r>
+        <w:t xml:space="preserve">, a</w:t>
+      </w:r>
+      <w:r>
+        <w:t xml:space="preserve"> </w:t>
+      </w:r>
+      <w:r>
+        <w:rPr>
+          <w:b/>
+          <w:bCs/>
+        </w:rPr>
+        <w:t xml:space="preserve">composite</w:t>
+      </w:r>
+      <w:r>
+        <w:t xml:space="preserve"> </w:t>
+      </w:r>
+      <w:r>
+        <w:t xml:space="preserve">report descriptor (a keyboard and a mouse at least, with report IDs). Circle's factory sent such an interface to</w:t>
+      </w:r>
+      <w:r>
+        <w:t xml:space="preserve"> </w:t>
+      </w:r>
+      <w:r>
+        <w:rPr>
+          <w:rStyle w:val="VerbatimChar"/>
+        </w:rPr>
+        <w:t xml:space="preserve">CUSBMouseDevice</w:t>
+      </w:r>
+      <w:r>
+        <w:t xml:space="preserve"> </w:t>
+      </w:r>
+      <w:r>
+        <w:t xml:space="preserve">(it saw Usage (Mouse)), which ignores the keyboard's reports -- and its</w:t>
+      </w:r>
+      <w:r>
+        <w:t xml:space="preserve"> </w:t>
+      </w:r>
+      <w:r>
+        <w:rPr>
+          <w:rStyle w:val="VerbatimChar"/>
+        </w:rPr>
+        <w:t xml:space="preserve">mouse1</w:t>
+      </w:r>
+      <w:r>
+        <w:t xml:space="preserve"> </w:t>
+      </w:r>
+      <w:r>
+        <w:t xml:space="preserve">then took the place</w:t>
+      </w:r>
+      <w:r>
+        <w:t xml:space="preserve"> </w:t>
+      </w:r>
+      <w:r>
+        <w:t xml:space="preserve">of a real USB mouse (the kernel follows</w:t>
+      </w:r>
+      <w:r>
+        <w:t xml:space="preserve"> </w:t>
+      </w:r>
+      <w:r>
+        <w:rPr>
+          <w:rStyle w:val="VerbatimChar"/>
+        </w:rPr>
+        <w:t xml:space="preserve">mouse1</w:t>
+      </w:r>
+      <w:r>
+        <w:t xml:space="preserve"> </w:t>
+      </w:r>
+      <w:r>
+        <w:t xml:space="preserve">alone).</w:t>
+      </w:r>
+    </w:p>
+    <w:p>
+      <w:pPr>
+        <w:pStyle w:val="BodyText"/>
+      </w:pPr>
+      <w:r>
+        <w:rPr>
+          <w:b/>
+          <w:bCs/>
+        </w:rPr>
+        <w:t xml:space="preserve">What.</w:t>
+      </w:r>
+    </w:p>
+    <w:p>
+      <w:pPr>
+        <w:pStyle w:val="Compact"/>
+        <w:numPr>
+          <w:ilvl w:val="0"/>
+          <w:numId w:val="1013"/>
+        </w:numPr>
+      </w:pPr>
+      <w:r>
+        <w:rPr>
+          <w:rStyle w:val="VerbatimChar"/>
+        </w:rPr>
+        <w:t xml:space="preserve">usbdevicefactory.cpp</w:t>
+      </w:r>
+      <w:r>
+        <w:t xml:space="preserve">,</w:t>
+      </w:r>
+      <w:r>
+        <w:t xml:space="preserve"> </w:t>
+      </w:r>
+      <w:r>
+        <w:rPr>
+          <w:rStyle w:val="VerbatimChar"/>
+        </w:rPr>
+        <w:t xml:space="preserve">GetGenericHIDDevice ()</w:t>
+      </w:r>
+      <w:r>
+        <w:t xml:space="preserve">: the whole report descriptor is looked at first; a Generic</w:t>
+      </w:r>
+      <w:r>
+        <w:t xml:space="preserve"> </w:t>
+      </w:r>
+      <w:r>
+        <w:t xml:space="preserve">Desktop Usage (Keyboard) makes it</w:t>
+      </w:r>
+      <w:r>
+        <w:t xml:space="preserve"> </w:t>
+      </w:r>
+      <w:r>
+        <w:rPr>
+          <w:rStyle w:val="VerbatimChar"/>
+          <w:b/>
+          <w:bCs/>
+        </w:rPr>
+        <w:t xml:space="preserve">CUSBKeyboardDevice</w:t>
+      </w:r>
+      <w:r>
+        <w:t xml:space="preserve">'s, then a Usage (Mouse)</w:t>
+      </w:r>
+      <w:r>
+        <w:t xml:space="preserve"> </w:t>
+      </w:r>
+      <w:r>
+        <w:rPr>
+          <w:rStyle w:val="VerbatimChar"/>
+        </w:rPr>
+        <w:t xml:space="preserve">CUSBMouseDevice</w:t>
+      </w:r>
+      <w:r>
+        <w:t xml:space="preserve">'s, else the</w:t>
+      </w:r>
+      <w:r>
+        <w:t xml:space="preserve"> </w:t>
+      </w:r>
+      <w:r>
+        <w:t xml:space="preserve">gamepad's (the digitizer still goes to the touch screen at once).</w:t>
+      </w:r>
+    </w:p>
+    <w:p>
+      <w:pPr>
+        <w:pStyle w:val="Compact"/>
+        <w:numPr>
+          <w:ilvl w:val="0"/>
+          <w:numId w:val="1013"/>
+        </w:numPr>
+      </w:pPr>
+      <w:r>
+        <w:rPr>
+          <w:rStyle w:val="VerbatimChar"/>
+        </w:rPr>
+        <w:t xml:space="preserve">CUSBKeyboardDevice::Configure ()</w:t>
+      </w:r>
+      <w:r>
+        <w:t xml:space="preserve">: an interface that is not a boot keyboard (subclass 1, protocol 1) is</w:t>
+      </w:r>
+      <w:r>
+        <w:t xml:space="preserve"> </w:t>
+      </w:r>
+      <w:r>
+        <w:t xml:space="preserve">configured from its report descriptor (</w:t>
+      </w:r>
+      <w:r>
+        <w:rPr>
+          <w:rStyle w:val="VerbatimChar"/>
+        </w:rPr>
+        <w:t xml:space="preserve">ConfigureFromReportDescriptor ()</w:t>
+      </w:r>
+      <w:r>
+        <w:t xml:space="preserve">): the descriptor written to the log</w:t>
+      </w:r>
+      <w:r>
+        <w:t xml:space="preserve"> </w:t>
+      </w:r>
+      <w:r>
+        <w:t xml:space="preserve">(</w:t>
+      </w:r>
+      <w:r>
+        <w:rPr>
+          <w:rStyle w:val="VerbatimChar"/>
+        </w:rPr>
+        <w:t xml:space="preserve">usbkbd</w:t>
+      </w:r>
+      <w:r>
+        <w:t xml:space="preserve">, debug, hex), its keyboard page's input fields decoded (</w:t>
+      </w:r>
+      <w:r>
+        <w:rPr>
+          <w:rStyle w:val="VerbatimChar"/>
+        </w:rPr>
+        <w:t xml:space="preserve">DecodeReportDescriptor ()</w:t>
+      </w:r>
+      <w:r>
+        <w:t xml:space="preserve">: report IDs,</w:t>
+      </w:r>
+      <w:r>
+        <w:t xml:space="preserve"> </w:t>
+      </w:r>
+      <w:r>
+        <w:t xml:space="preserve">Push / Pop, arrays and bitmaps -- NKRO --, up to 8 fields), the transfer sized for the interface's largest input</w:t>
+      </w:r>
+      <w:r>
+        <w:t xml:space="preserve"> </w:t>
+      </w:r>
+      <w:r>
+        <w:t xml:space="preserve">report, the LEDs' output report (its ID).</w:t>
+      </w:r>
+      <w:r>
+        <w:t xml:space="preserve"> </w:t>
+      </w:r>
+      <w:r>
+        <w:rPr>
+          <w:rStyle w:val="VerbatimChar"/>
+        </w:rPr>
+        <w:t xml:space="preserve">ReportHandler ()</w:t>
+      </w:r>
+      <w:r>
+        <w:t xml:space="preserve"> </w:t>
+      </w:r>
+      <w:r>
+        <w:t xml:space="preserve">turns each report of a keyboard field's ID into a</w:t>
+      </w:r>
+      <w:r>
+        <w:t xml:space="preserve"> </w:t>
+      </w:r>
+      <w:r>
+        <w:t xml:space="preserve">boot report (</w:t>
+      </w:r>
+      <w:r>
+        <w:rPr>
+          <w:rStyle w:val="VerbatimChar"/>
+        </w:rPr>
+        <w:t xml:space="preserve">TranslateReport ()</w:t>
+      </w:r>
+      <w:r>
+        <w:t xml:space="preserve">: modifiers E0-E7, six keys), then goes on as before; the interface's other</w:t>
+      </w:r>
+      <w:r>
+        <w:t xml:space="preserve"> </w:t>
+      </w:r>
+      <w:r>
+        <w:t xml:space="preserve">reports (its mouse, consumer keys) are ignored. Boot keyboards are unchanged.</w:t>
+      </w:r>
+    </w:p>
+    <w:p>
+      <w:pPr>
+        <w:pStyle w:val="FirstParagraph"/>
+      </w:pPr>
+      <w:r>
+        <w:t xml:space="preserve">Fork commit</w:t>
+      </w:r>
+      <w:r>
+        <w:t xml:space="preserve"> </w:t>
+      </w:r>
+      <w:r>
+        <w:rPr>
+          <w:rStyle w:val="VerbatimChar"/>
+        </w:rPr>
+        <w:t xml:space="preserve">d29dc22e</w:t>
+      </w:r>
+      <w:r>
+        <w:t xml:space="preserve">. Tried on the device (2026-10-26): the keyboard types. The interface's mouse and any</w:t>
+      </w:r>
+      <w:r>
+        <w:t xml:space="preserve"> </w:t>
+      </w:r>
+      <w:r>
+        <w:t xml:space="preserve">gamepad in it are not driven.</w:t>
+      </w:r>
+    </w:p>
+    <w:bookmarkEnd w:id="57"/>
+    <w:bookmarkStart w:id="58" w:name="Xbb229ead116438493d4da3a4e10dcd9c75ad893"/>
+    <w:p>
+      <w:pPr>
+        <w:pStyle w:val="Heading2"/>
+      </w:pPr>
+      <w:r>
+        <w:t xml:space="preserve">35. A full-speed device on the Pi 4's DWC OTG root port</w:t>
+      </w:r>
+    </w:p>
+    <w:p>
+      <w:pPr>
+        <w:pStyle w:val="FirstParagraph"/>
+      </w:pPr>
+      <w:r>
+        <w:rPr>
+          <w:b/>
+          <w:bCs/>
+        </w:rPr>
+        <w:t xml:space="preserve">Why.</w:t>
+      </w:r>
+      <w:r>
+        <w:t xml:space="preserve"> </w:t>
+      </w:r>
+      <w:r>
+        <w:t xml:space="preserve">With §33 and §34 the PocketTerm35's RP2040 was enumerated, but no keyboard report ever came, and the</w:t>
+      </w:r>
+      <w:r>
+        <w:t xml:space="preserve"> </w:t>
+      </w:r>
+      <w:r>
+        <w:t xml:space="preserve">device left and came back every 10-20 s; after a while a kernel panic. Three faults, found with counters in the</w:t>
+      </w:r>
+      <w:r>
+        <w:t xml:space="preserve"> </w:t>
+      </w:r>
+      <w:r>
+        <w:t xml:space="preserve">driver (2026-10-26):</w:t>
+      </w:r>
+    </w:p>
+    <w:p>
+      <w:pPr>
+        <w:pStyle w:val="Compact"/>
+        <w:numPr>
+          <w:ilvl w:val="0"/>
+          <w:numId w:val="1014"/>
+        </w:numPr>
+      </w:pPr>
+      <w:r>
+        <w:rPr>
+          <w:b/>
+          <w:bCs/>
+        </w:rPr>
+        <w:t xml:space="preserve">The periodic transfers' frame.</w:t>
+      </w:r>
+      <w:r>
+        <w:t xml:space="preserve"> </w:t>
+      </w:r>
+      <w:r>
+        <w:t xml:space="preserve">Every interrupt transfer ended in a</w:t>
+      </w:r>
+      <w:r>
+        <w:t xml:space="preserve"> </w:t>
+      </w:r>
+      <w:r>
+        <w:rPr>
+          <w:b/>
+          <w:bCs/>
+        </w:rPr>
+        <w:t xml:space="preserve">frame overrun</w:t>
+      </w:r>
+      <w:r>
+        <w:t xml:space="preserve"> </w:t>
+      </w:r>
+      <w:r>
+        <w:t xml:space="preserve">(8251 of 8254): Circle</w:t>
+      </w:r>
+      <w:r>
+        <w:t xml:space="preserve"> </w:t>
+      </w:r>
+      <w:r>
+        <w:t xml:space="preserve">scheduled it for the</w:t>
+      </w:r>
+      <w:r>
+        <w:t xml:space="preserve"> </w:t>
+      </w:r>
+      <w:r>
+        <w:rPr>
+          <w:i/>
+          <w:iCs/>
+        </w:rPr>
+        <w:t xml:space="preserve">current</w:t>
+      </w:r>
+      <w:r>
+        <w:t xml:space="preserve"> </w:t>
+      </w:r>
+      <w:r>
+        <w:t xml:space="preserve">frame (</w:t>
+      </w:r>
+      <w:r>
+        <w:rPr>
+          <w:rStyle w:val="VerbatimChar"/>
+        </w:rPr>
+        <w:t xml:space="preserve">HCCHAR.OddFrm</w:t>
+      </w:r>
+      <w:r>
+        <w:t xml:space="preserve"> </w:t>
+      </w:r>
+      <w:r>
+        <w:t xml:space="preserve">= the frame number's parity). On the Pi 1-3 the devices sit</w:t>
+      </w:r>
+      <w:r>
+        <w:t xml:space="preserve"> </w:t>
+      </w:r>
+      <w:r>
+        <w:t xml:space="preserve">behind the LAN9514's high-speed hub (split transactions); here a full-speed device is on the root port itself.</w:t>
+      </w:r>
+      <w:r>
+        <w:t xml:space="preserve"> </w:t>
+      </w:r>
+      <w:r>
+        <w:rPr>
+          <w:rStyle w:val="VerbatimChar"/>
+        </w:rPr>
+        <w:t xml:space="preserve">dwhcidevice.cpp</w:t>
+      </w:r>
+      <w:r>
+        <w:t xml:space="preserve">,</w:t>
+      </w:r>
+      <w:r>
+        <w:t xml:space="preserve"> </w:t>
+      </w:r>
+      <w:r>
+        <w:rPr>
+          <w:rStyle w:val="VerbatimChar"/>
+        </w:rPr>
+        <w:t xml:space="preserve">StartChannel ()</w:t>
+      </w:r>
+      <w:r>
+        <w:t xml:space="preserve">: the periodic transfers of a device on the root port (no split) are</w:t>
+      </w:r>
+      <w:r>
+        <w:t xml:space="preserve"> </w:t>
+      </w:r>
+      <w:r>
+        <w:t xml:space="preserve">scheduled for the</w:t>
+      </w:r>
+      <w:r>
+        <w:t xml:space="preserve"> </w:t>
+      </w:r>
+      <w:r>
+        <w:rPr>
+          <w:b/>
+          <w:bCs/>
+        </w:rPr>
+        <w:t xml:space="preserve">next</w:t>
+      </w:r>
+      <w:r>
+        <w:t xml:space="preserve"> </w:t>
+      </w:r>
+      <w:r>
+        <w:t xml:space="preserve">frame on the Pi 4 (</w:t>
+      </w:r>
+      <w:r>
+        <w:rPr>
+          <w:rStyle w:val="VerbatimChar"/>
+        </w:rPr>
+        <w:t xml:space="preserve">m_bPeriodicNextFrame</w:t>
+      </w:r>
+      <w:r>
+        <w:t xml:space="preserve">, as Linux's dwc2 puts them where they will be</w:t>
+      </w:r>
+      <w:r>
+        <w:t xml:space="preserve"> </w:t>
+      </w:r>
+      <w:r>
+        <w:t xml:space="preserve">on the wire), and 16 frame overruns in a row switch to the other frame either way.</w:t>
+      </w:r>
+    </w:p>
+    <w:p>
+      <w:pPr>
+        <w:pStyle w:val="Compact"/>
+        <w:numPr>
+          <w:ilvl w:val="0"/>
+          <w:numId w:val="1014"/>
+        </w:numPr>
+      </w:pPr>
+      <w:r>
+        <w:rPr>
+          <w:b/>
+          <w:bCs/>
+        </w:rPr>
+        <w:t xml:space="preserve">A removed device's requests.</w:t>
+      </w:r>
+      <w:r>
+        <w:t xml:space="preserve"> </w:t>
+      </w:r>
+      <w:r>
+        <w:rPr>
+          <w:rStyle w:val="VerbatimChar"/>
+        </w:rPr>
+        <w:t xml:space="preserve">CancelDeviceTransactions ()</w:t>
+      </w:r>
+      <w:r>
+        <w:t xml:space="preserve"> </w:t>
+      </w:r>
+      <w:r>
+        <w:t xml:space="preserve">aborted the device's channels, but their requests</w:t>
+      </w:r>
+      <w:r>
+        <w:t xml:space="preserve"> </w:t>
+      </w:r>
+      <w:r>
+        <w:t xml:space="preserve">completed afterwards, from the interrupt, when the device and its drivers were already deleted: the HID driver</w:t>
+      </w:r>
+      <w:r>
+        <w:t xml:space="preserve"> </w:t>
+      </w:r>
+      <w:r>
+        <w:t xml:space="preserve">touched its deleted self (the panic,</w:t>
+      </w:r>
+      <w:r>
+        <w:t xml:space="preserve"> </w:t>
+      </w:r>
+      <w:r>
+        <w:rPr>
+          <w:rStyle w:val="VerbatimChar"/>
+        </w:rPr>
+        <w:t xml:space="preserve">CUSBHIDDevice::CompletionRoutine</w:t>
+      </w:r>
+      <w:r>
+        <w:t xml:space="preserve">) and submitted its next request. The</w:t>
+      </w:r>
+      <w:r>
+        <w:t xml:space="preserve"> </w:t>
+      </w:r>
+      <w:r>
+        <w:t xml:space="preserve">device's asynchronous requests on a channel now get a completion that only frees them (</w:t>
+      </w:r>
+      <w:r>
+        <w:rPr>
+          <w:rStyle w:val="VerbatimChar"/>
+        </w:rPr>
+        <w:t xml:space="preserve">DiscardedCompletion</w:t>
+      </w:r>
+      <w:r>
+        <w:t xml:space="preserve">),</w:t>
+      </w:r>
+      <w:r>
+        <w:t xml:space="preserve"> </w:t>
+      </w:r>
+      <w:r>
+        <w:t xml:space="preserve">and the function waits for their channels (100 ms at most).</w:t>
+      </w:r>
+      <w:r>
+        <w:t xml:space="preserve"> </w:t>
+      </w:r>
+      <w:r>
+        <w:rPr>
+          <w:rStyle w:val="VerbatimChar"/>
+        </w:rPr>
+        <w:t xml:space="preserve">CUSBRequest::GetCompletionRoutine ()</w:t>
+      </w:r>
+      <w:r>
+        <w:t xml:space="preserve"> </w:t>
+      </w:r>
+      <w:r>
+        <w:t xml:space="preserve">tells a</w:t>
+      </w:r>
+      <w:r>
+        <w:t xml:space="preserve"> </w:t>
+      </w:r>
+      <w:r>
+        <w:t xml:space="preserve">blocking request (the driver's own waiter) from them.</w:t>
+      </w:r>
+    </w:p>
+    <w:p>
+      <w:pPr>
+        <w:pStyle w:val="Compact"/>
+        <w:numPr>
+          <w:ilvl w:val="0"/>
+          <w:numId w:val="1014"/>
+        </w:numPr>
+      </w:pPr>
+      <w:r>
+        <w:rPr>
+          <w:b/>
+          <w:bCs/>
+        </w:rPr>
+        <w:t xml:space="preserve">DTR.</w:t>
+      </w:r>
+      <w:r>
+        <w:t xml:space="preserve"> </w:t>
+      </w:r>
+      <w:r>
+        <w:rPr>
+          <w:rStyle w:val="VerbatimChar"/>
+        </w:rPr>
+        <w:t xml:space="preserve">CUSBSerialCDCDevice::Configure ()</w:t>
+      </w:r>
+      <w:r>
+        <w:t xml:space="preserve"> </w:t>
+      </w:r>
+      <w:r>
+        <w:t xml:space="preserve">raised DTR and RTS at once; the RP2040 (its CDC serial port beside</w:t>
+      </w:r>
+      <w:r>
+        <w:t xml:space="preserve"> </w:t>
+      </w:r>
+      <w:r>
+        <w:t xml:space="preserve">the keyboard) then took a terminal for reading it, blocked writing to a port nothing read, and its watchdog</w:t>
+      </w:r>
+      <w:r>
+        <w:t xml:space="preserve"> </w:t>
+      </w:r>
+      <w:r>
+        <w:t xml:space="preserve">restarted it (the device leaving and coming back). DTR and RTS are now raised at the port's first</w:t>
+      </w:r>
+      <w:r>
+        <w:t xml:space="preserve"> </w:t>
+      </w:r>
+      <w:r>
+        <w:rPr>
+          <w:rStyle w:val="VerbatimChar"/>
+        </w:rPr>
+        <w:t xml:space="preserve">Read ()</w:t>
+      </w:r>
+      <w:r>
+        <w:t xml:space="preserve"> </w:t>
+      </w:r>
+      <w:r>
+        <w:t xml:space="preserve">or</w:t>
+      </w:r>
+      <w:r>
+        <w:t xml:space="preserve"> </w:t>
+      </w:r>
+      <w:r>
+        <w:rPr>
+          <w:rStyle w:val="VerbatimChar"/>
+        </w:rPr>
+        <w:t xml:space="preserve">Write ()</w:t>
+      </w:r>
+      <w:r>
+        <w:t xml:space="preserve"> </w:t>
+      </w:r>
+      <w:r>
+        <w:t xml:space="preserve">(</w:t>
+      </w:r>
+      <w:r>
+        <w:rPr>
+          <w:rStyle w:val="VerbatimChar"/>
+        </w:rPr>
+        <w:t xml:space="preserve">CUSBSerialHostDevice::FirstUse ()</w:t>
+      </w:r>
+      <w:r>
+        <w:t xml:space="preserve">), as Linux does when the tty is opened.</w:t>
+      </w:r>
+    </w:p>
+    <w:p>
+      <w:pPr>
+        <w:pStyle w:val="FirstParagraph"/>
+      </w:pPr>
+      <w:r>
+        <w:t xml:space="preserve">The DWC OTG FIFOs were checked: depth 4080 words, the 3 x 1024 Circle programs fit. Fork commits</w:t>
+      </w:r>
+      <w:r>
+        <w:t xml:space="preserve"> </w:t>
+      </w:r>
+      <w:r>
+        <w:rPr>
+          <w:rStyle w:val="VerbatimChar"/>
+        </w:rPr>
+        <w:t xml:space="preserve">09cfd2a3</w:t>
+      </w:r>
+      <w:r>
+        <w:t xml:space="preserve"> </w:t>
+      </w:r>
+      <w:r>
+        <w:t xml:space="preserve">(the frame, the requests) and</w:t>
+      </w:r>
+      <w:r>
+        <w:t xml:space="preserve"> </w:t>
+      </w:r>
+      <w:r>
+        <w:rPr>
+          <w:rStyle w:val="VerbatimChar"/>
+        </w:rPr>
+        <w:t xml:space="preserve">d3e518ab</w:t>
+      </w:r>
+      <w:r>
+        <w:t xml:space="preserve"> </w:t>
+      </w:r>
+      <w:r>
+        <w:t xml:space="preserve">(DTR). Tried on the device: the keyboard types, no disconnection.</w:t>
+      </w:r>
+    </w:p>
+    <w:bookmarkEnd w:id="58"/>
+    <w:bookmarkStart w:id="59" w:name="X9d96e9f2681eb7ec7fbd4bf0f78b9c8b2e5dfbc"/>
+    <w:p>
+      <w:pPr>
+        <w:pStyle w:val="Heading2"/>
+      </w:pPr>
+      <w:r>
+        <w:t xml:space="preserve">36. A USB audio device's continuous range of rates</w:t>
+      </w:r>
+    </w:p>
+    <w:p>
+      <w:pPr>
+        <w:pStyle w:val="FirstParagraph"/>
+      </w:pPr>
+      <w:r>
+        <w:rPr>
+          <w:b/>
+          <w:bCs/>
+        </w:rPr>
+        <w:t xml:space="preserve">Why.</w:t>
+      </w:r>
+      <w:r>
+        <w:t xml:space="preserve"> </w:t>
+      </w:r>
+      <w:r>
+        <w:rPr>
+          <w:rStyle w:val="VerbatimChar"/>
+        </w:rPr>
+        <w:t xml:space="preserve">CUSBAudioStreamingDevice::Setup ()</w:t>
+      </w:r>
+      <w:r>
+        <w:t xml:space="preserve"> </w:t>
+      </w:r>
+      <w:r>
+        <w:t xml:space="preserve">checked a requested rate against the device's ranges as</w:t>
+      </w:r>
+      <w:r>
+        <w:t xml:space="preserve"> </w:t>
+      </w:r>
+      <w:r>
+        <w:rPr>
+          <w:rStyle w:val="VerbatimChar"/>
+        </w:rPr>
+        <w:t xml:space="preserve">Min &gt;= rate &amp;&amp; Max &lt;= rate</w:t>
+      </w:r>
+      <w:r>
+        <w:t xml:space="preserve">: a device with a continuous range (16 to 48 kHz) refused every rate inside it, and</w:t>
+      </w:r>
+      <w:r>
+        <w:t xml:space="preserve"> </w:t>
+      </w:r>
+      <w:r>
+        <w:t xml:space="preserve">only a range of one rate worked. PocketQI found it with a USB headset's microphone at 16 kHz.</w:t>
+      </w:r>
+    </w:p>
+    <w:p>
+      <w:pPr>
+        <w:pStyle w:val="BodyText"/>
+      </w:pPr>
+      <w:r>
+        <w:rPr>
+          <w:b/>
+          <w:bCs/>
+        </w:rPr>
+        <w:t xml:space="preserve">What.</w:t>
+      </w:r>
+      <w:r>
+        <w:t xml:space="preserve"> </w:t>
+      </w:r>
+      <w:r>
+        <w:rPr>
+          <w:rStyle w:val="VerbatimChar"/>
+        </w:rPr>
+        <w:t xml:space="preserve">lib/usb/usbaudiostreaming.cpp</w:t>
+      </w:r>
+      <w:r>
+        <w:t xml:space="preserve">:</w:t>
+      </w:r>
+      <w:r>
+        <w:t xml:space="preserve"> </w:t>
+      </w:r>
+      <w:r>
+        <w:rPr>
+          <w:rStyle w:val="VerbatimChar"/>
+        </w:rPr>
+        <w:t xml:space="preserve">Min &lt;= rate &amp;&amp; Max &gt;= rate</w:t>
+      </w:r>
+      <w:r>
+        <w:t xml:space="preserve"> </w:t>
+      </w:r>
+      <w:r>
+        <w:t xml:space="preserve">(2026-10-26, Onyx's microphone: kapi</w:t>
+      </w:r>
+      <w:r>
+        <w:t xml:space="preserve"> </w:t>
+      </w:r>
+      <w:r>
+        <w:t xml:space="preserve">v99</w:t>
+      </w:r>
+      <w:r>
+        <w:t xml:space="preserve"> </w:t>
+      </w:r>
+      <w:r>
+        <w:rPr>
+          <w:rStyle w:val="VerbatimChar"/>
+        </w:rPr>
+        <w:t xml:space="preserve">sound_input</w:t>
+      </w:r>
+      <w:r>
+        <w:t xml:space="preserve">; PocketQI's patch</w:t>
+      </w:r>
+      <w:r>
+        <w:t xml:space="preserve"> </w:t>
+      </w:r>
+      <w:r>
+        <w:rPr>
+          <w:rStyle w:val="VerbatimChar"/>
+        </w:rPr>
+        <w:t xml:space="preserve">11-usb-audio-plage</w:t>
+      </w:r>
+      <w:r>
+        <w:t xml:space="preserve">).</w:t>
+      </w:r>
+    </w:p>
+    <w:bookmarkEnd w:id="59"/>
+    <w:bookmarkStart w:id="60" w:name="Xcd4762a6edece8081127c8fa845986f1aa9c44d"/>
+    <w:p>
+      <w:pPr>
+        <w:pStyle w:val="Heading2"/>
+      </w:pPr>
+      <w:r>
+        <w:t xml:space="preserve">37. The log's events timed since boot, a whole boot kept</w:t>
+      </w:r>
+    </w:p>
+    <w:p>
+      <w:pPr>
+        <w:pStyle w:val="FirstParagraph"/>
+      </w:pPr>
+      <w:r>
+        <w:rPr>
+          <w:b/>
+          <w:bCs/>
+        </w:rPr>
+        <w:t xml:space="preserve">Why.</w:t>
+      </w:r>
+      <w:r>
+        <w:t xml:space="preserve"> </w:t>
+      </w:r>
+      <w:r>
+        <w:rPr>
+          <w:rStyle w:val="VerbatimChar"/>
+        </w:rPr>
+        <w:t xml:space="preserve">kmsg</w:t>
+      </w:r>
+      <w:r>
+        <w:t xml:space="preserve"> </w:t>
+      </w:r>
+      <w:r>
+        <w:t xml:space="preserve">(kapi</w:t>
+      </w:r>
+      <w:r>
+        <w:t xml:space="preserve"> </w:t>
+      </w:r>
+      <w:r>
+        <w:rPr>
+          <w:rStyle w:val="VerbatimChar"/>
+        </w:rPr>
+        <w:t xml:space="preserve">klog_read</w:t>
+      </w:r>
+      <w:r>
+        <w:t xml:space="preserve">) could not time a boot: Circle's events carry the wall clock only (</w:t>
+      </w:r>
+      <w:r>
+        <w:rPr>
+          <w:rStyle w:val="VerbatimChar"/>
+        </w:rPr>
+        <w:t xml:space="preserve">GetLocalTime</w:t>
+      </w:r>
+      <w:r>
+        <w:t xml:space="preserve">,</w:t>
+      </w:r>
+      <w:r>
+        <w:t xml:space="preserve"> </w:t>
+      </w:r>
+      <w:r>
+        <w:t xml:space="preserve">set later by NTP: the boot's events and the later ones do not share an origin), and the event queue kept the</w:t>
+      </w:r>
+      <w:r>
+        <w:t xml:space="preserve"> </w:t>
+      </w:r>
+      <w:r>
+        <w:t xml:space="preserve">last 50, long gone when a telnet session can start</w:t>
+      </w:r>
+      <w:r>
+        <w:t xml:space="preserve"> </w:t>
+      </w:r>
+      <w:r>
+        <w:rPr>
+          <w:rStyle w:val="VerbatimChar"/>
+        </w:rPr>
+        <w:t xml:space="preserve">kmsg</w:t>
+      </w:r>
+      <w:r>
+        <w:t xml:space="preserve"> </w:t>
+      </w:r>
+      <w:r>
+        <w:t xml:space="preserve">(the Programmez! article asked how long Onyx takes to</w:t>
+      </w:r>
+      <w:r>
+        <w:t xml:space="preserve"> </w:t>
+      </w:r>
+      <w:r>
+        <w:t xml:space="preserve">start, 2026-10-27).</w:t>
+      </w:r>
+    </w:p>
+    <w:p>
+      <w:pPr>
+        <w:pStyle w:val="BodyText"/>
+      </w:pPr>
+      <w:r>
+        <w:rPr>
+          <w:b/>
+          <w:bCs/>
+        </w:rPr>
+        <w:t xml:space="preserve">What.</w:t>
+      </w:r>
+      <w:r>
+        <w:t xml:space="preserve"> </w:t>
+      </w:r>
+      <w:r>
+        <w:rPr>
+          <w:rStyle w:val="VerbatimChar"/>
+        </w:rPr>
+        <w:t xml:space="preserve">TLogEvent</w:t>
+      </w:r>
+      <w:r>
+        <w:t xml:space="preserve"> </w:t>
+      </w:r>
+      <w:r>
+        <w:t xml:space="preserve">notes</w:t>
+      </w:r>
+      <w:r>
+        <w:t xml:space="preserve"> </w:t>
+      </w:r>
+      <w:r>
+        <w:rPr>
+          <w:rStyle w:val="VerbatimChar"/>
+        </w:rPr>
+        <w:t xml:space="preserve">CTimer::GetClockTicks64 ()</w:t>
+      </w:r>
+      <w:r>
+        <w:t xml:space="preserve"> </w:t>
+      </w:r>
+      <w:r>
+        <w:t xml:space="preserve">(microseconds since boot) as it is written; a second</w:t>
+      </w:r>
+      <w:r>
+        <w:t xml:space="preserve"> </w:t>
+      </w:r>
+      <w:r>
+        <w:rPr>
+          <w:rStyle w:val="VerbatimChar"/>
+        </w:rPr>
+        <w:t xml:space="preserve">CLogger::ReadEvent</w:t>
+      </w:r>
+      <w:r>
+        <w:t xml:space="preserve"> </w:t>
+      </w:r>
+      <w:r>
+        <w:t xml:space="preserve">returns it in</w:t>
+      </w:r>
+      <w:r>
+        <w:t xml:space="preserve"> </w:t>
+      </w:r>
+      <w:r>
+        <w:rPr>
+          <w:rStyle w:val="VerbatimChar"/>
+        </w:rPr>
+        <w:t xml:space="preserve">u64 *pUptimeMicros</w:t>
+      </w:r>
+      <w:r>
+        <w:t xml:space="preserve"> </w:t>
+      </w:r>
+      <w:r>
+        <w:t xml:space="preserve">(the upstream one is kept, it calls the new one).</w:t>
+      </w:r>
+      <w:r>
+        <w:t xml:space="preserve"> </w:t>
+      </w:r>
+      <w:r>
+        <w:rPr>
+          <w:rStyle w:val="VerbatimChar"/>
+        </w:rPr>
+        <w:t xml:space="preserve">LOG_QUEUE_SIZE</w:t>
+      </w:r>
+      <w:r>
+        <w:t xml:space="preserve"> </w:t>
+      </w:r>
+      <w:r>
+        <w:t xml:space="preserve">50 → 1024 (an event is about 270 bytes on the heap, only while it is queued: 270 KB at most).</w:t>
+      </w:r>
+      <w:r>
+        <w:t xml:space="preserve"> </w:t>
+      </w:r>
+      <w:r>
+        <w:t xml:space="preserve">The kernel's</w:t>
+      </w:r>
+      <w:r>
+        <w:t xml:space="preserve"> </w:t>
+      </w:r>
+      <w:r>
+        <w:rPr>
+          <w:rStyle w:val="VerbatimChar"/>
+        </w:rPr>
+        <w:t xml:space="preserve">kapi_klog_read_at</w:t>
+      </w:r>
+      <w:r>
+        <w:t xml:space="preserve"> </w:t>
+      </w:r>
+      <w:r>
+        <w:t xml:space="preserve">(kapi v100) passes it on;</w:t>
+      </w:r>
+      <w:r>
+        <w:t xml:space="preserve"> </w:t>
+      </w:r>
+      <w:r>
+        <w:rPr>
+          <w:rStyle w:val="VerbatimChar"/>
+        </w:rPr>
+        <w:t xml:space="preserve">kmsg</w:t>
+      </w:r>
+      <w:r>
+        <w:t xml:space="preserve"> </w:t>
+      </w:r>
+      <w:r>
+        <w:t xml:space="preserve">prints</w:t>
+      </w:r>
+      <w:r>
+        <w:t xml:space="preserve"> </w:t>
+      </w:r>
+      <w:r>
+        <w:rPr>
+          <w:rStyle w:val="VerbatimChar"/>
+        </w:rPr>
+        <w:t xml:space="preserve">[   12.345]</w:t>
+      </w:r>
+      <w:r>
+        <w:t xml:space="preserve"> </w:t>
+      </w:r>
+      <w:r>
+        <w:t xml:space="preserve">before each line. Every</w:t>
+      </w:r>
+      <w:r>
+        <w:t xml:space="preserve"> </w:t>
+      </w:r>
+      <w:r>
+        <w:t xml:space="preserve">library is rebuilt (</w:t>
+      </w:r>
+      <w:r>
+        <w:rPr>
+          <w:rStyle w:val="VerbatimChar"/>
+        </w:rPr>
+        <w:t xml:space="preserve">CLogger</w:t>
+      </w:r>
+      <w:r>
+        <w:t xml:space="preserve"> </w:t>
+      </w:r>
+      <w:r>
+        <w:t xml:space="preserve">changed size).</w:t>
+      </w:r>
+    </w:p>
+    <w:bookmarkEnd w:id="60"/>
+    <w:bookmarkStart w:id="62" w:name="contributions-to-upstream-circle"/>
+    <w:p>
+      <w:pPr>
+        <w:pStyle w:val="Heading2"/>
+      </w:pPr>
+      <w:r>
+        <w:t xml:space="preserve">Contributions to upstream Circle</w:t>
+      </w:r>
+    </w:p>
+    <w:p>
+      <w:pPr>
+        <w:pStyle w:val="FirstParagraph"/>
+      </w:pPr>
+      <w:r>
         <w:t xml:space="preserve">The fork's changes useful to every Circle user are prepared as clean pull-request branches on</w:t>
       </w:r>
       <w:r>
@@ -19942,7 +21985,7 @@
       <w:r>
         <w:t xml:space="preserve"> </w:t>
       </w:r>
-      <w:hyperlink r:id="rId56">
+      <w:hyperlink r:id="rId61">
         <w:r>
           <w:rPr>
             <w:rStyle w:val="VerbatimChar"/>
@@ -19954,8 +21997,8 @@
         <w:t xml:space="preserve">.</w:t>
       </w:r>
     </w:p>
-    <w:bookmarkEnd w:id="57"/>
-    <w:bookmarkStart w:id="58" w:name="upstream-merges"/>
+    <w:bookmarkEnd w:id="62"/>
+    <w:bookmarkStart w:id="63" w:name="upstream-merges"/>
     <w:p>
       <w:pPr>
         <w:pStyle w:val="Heading2"/>
@@ -20344,8 +22387,8 @@
         <w:t xml:space="preserve">yet: a keyboard unplugged and plugged again (its layout kept), the 8BitDo / Xbox 360 wireless devices.</w:t>
       </w:r>
     </w:p>
-    <w:bookmarkEnd w:id="58"/>
-    <w:bookmarkStart w:id="59" w:name="updating-the-fork-submodule"/>
+    <w:bookmarkEnd w:id="63"/>
+    <w:bookmarkStart w:id="64" w:name="updating-the-fork-submodule"/>
     <w:p>
       <w:pPr>
         <w:pStyle w:val="Heading2"/>
@@ -20524,7 +22567,7 @@
         <w:t xml:space="preserve">"Bump circle submodule"</w:t>
       </w:r>
     </w:p>
-    <w:bookmarkEnd w:id="59"/>
+    <w:bookmarkEnd w:id="64"/>
     <w:sectPr>
       <w:footerReference r:id="rId9" w:type="default"/>
       <w:footnotePr>
@@ -20930,6 +22973,15 @@
     <w:abstractNumId w:val="991"/>
   </w:num>
   <w:num w:numId="1011">
+    <w:abstractNumId w:val="991"/>
+  </w:num>
+  <w:num w:numId="1012">
+    <w:abstractNumId w:val="991"/>
+  </w:num>
+  <w:num w:numId="1013">
+    <w:abstractNumId w:val="991"/>
+  </w:num>
+  <w:num w:numId="1014">
     <w:abstractNumId w:val="991"/>
   </w:num>
 </w:numbering>

</xml_diff>